<commit_message>
qc-catalogue-api: update to v3
Main changes:
* API version number v2 -> v3
* XML namespaces updated to accommodate the updated qc.xsd
  ("2026-01" namespaces to "2026-04")
* Clarify API behaviour/restrictions especially:
  * Version numbers must not have a "patch" component
  * Only versions with a Status of "published" or "withdrawn" are considered
  * Clarify response upon success and error
</commit_message>
<xml_diff>
--- a/qc-catalogue-api/qc-catalogue-api.docx
+++ b/qc-catalogue-api/qc-catalogue-api.docx
@@ -49,7 +49,25 @@
           <w:sz w:val="28"/>
           <w:szCs w:val="28"/>
         </w:rPr>
-        <w:t xml:space="preserve"> = "v2"</w:t>
+        <w:t xml:space="preserve"> = "v</w:t>
+      </w:r>
+      <w:r>
+        <w:rPr>
+          <w:i/>
+          <w:iCs/>
+          <w:sz w:val="28"/>
+          <w:szCs w:val="28"/>
+        </w:rPr>
+        <w:t>3</w:t>
+      </w:r>
+      <w:r>
+        <w:rPr>
+          <w:i/>
+          <w:iCs/>
+          <w:sz w:val="28"/>
+          <w:szCs w:val="28"/>
+        </w:rPr>
+        <w:t>"</w:t>
       </w:r>
     </w:p>
     <w:p>
@@ -151,16 +169,21 @@
         <w:t>”</w:t>
       </w:r>
       <w:r>
-        <w:t xml:space="preserve"> in </w:t>
-      </w:r>
-      <w:r>
-        <w:t>the EBU QC Data Model</w:t>
+        <w:t xml:space="preserve"> in the EBU QC Data Model</w:t>
       </w:r>
       <w:r>
         <w:t xml:space="preserve">. This is </w:t>
       </w:r>
       <w:r>
-        <w:t xml:space="preserve">not to be confused with the </w:t>
+        <w:t xml:space="preserve">not to be </w:t>
+      </w:r>
+      <w:proofErr w:type="gramStart"/>
+      <w:r>
+        <w:t>confused</w:t>
+      </w:r>
+      <w:proofErr w:type="gramEnd"/>
+      <w:r>
+        <w:t xml:space="preserve"> with the </w:t>
       </w:r>
       <w:proofErr w:type="spellStart"/>
       <w:r>
@@ -583,7 +606,7 @@
         <w:t>v</w:t>
       </w:r>
       <w:r>
-        <w:t>2</w:t>
+        <w:t>3</w:t>
       </w:r>
       <w:r>
         <w:t>"</w:t>
@@ -643,7 +666,19 @@
         <w:pStyle w:val="SNote"/>
       </w:pPr>
       <w:r>
-        <w:t>EXAMPLE: The following retrieves all items from the catalog</w:t>
+        <w:t xml:space="preserve">EXAMPLE: The following retrieves </w:t>
+      </w:r>
+      <w:r>
+        <w:t>'</w:t>
+      </w:r>
+      <w:r>
+        <w:t>all</w:t>
+      </w:r>
+      <w:r>
+        <w:t>'</w:t>
+      </w:r>
+      <w:r>
+        <w:t xml:space="preserve"> items from the catalog</w:t>
       </w:r>
       <w:r>
         <w:t>ue</w:t>
@@ -670,6 +705,9 @@
         <w:fldChar w:fldCharType="end"/>
       </w:r>
       <w:r>
+        <w:t xml:space="preserve"> for details</w:t>
+      </w:r>
+      <w:r>
         <w:t xml:space="preserve">) </w:t>
       </w:r>
       <w:r>
@@ -684,7 +722,7 @@
         <w:t>GET https://localhost/qccatalog/v</w:t>
       </w:r>
       <w:r>
-        <w:t>2</w:t>
+        <w:t>3</w:t>
       </w:r>
       <w:r>
         <w:t>/items</w:t>
@@ -738,14 +776,27 @@
       <w:r>
         <w:t xml:space="preserve">Table </w:t>
       </w:r>
-      <w:fldSimple w:instr=" SEQ Table \* ARABIC ">
-        <w:r>
-          <w:rPr>
-            <w:noProof/>
-          </w:rPr>
-          <w:t>1</w:t>
-        </w:r>
-      </w:fldSimple>
+      <w:r>
+        <w:fldChar w:fldCharType="begin"/>
+      </w:r>
+      <w:r>
+        <w:instrText xml:space="preserve"> SEQ Table \* ARABIC </w:instrText>
+      </w:r>
+      <w:r>
+        <w:fldChar w:fldCharType="separate"/>
+      </w:r>
+      <w:r>
+        <w:rPr>
+          <w:noProof/>
+        </w:rPr>
+        <w:t>1</w:t>
+      </w:r>
+      <w:r>
+        <w:rPr>
+          <w:noProof/>
+        </w:rPr>
+        <w:fldChar w:fldCharType="end"/>
+      </w:r>
       <w:bookmarkEnd w:id="0"/>
       <w:r>
         <w:t>. XML Namespaces and Prefixes.</w:t>
@@ -845,7 +896,13 @@
               <w:rPr>
                 <w:lang w:val="de-CH"/>
               </w:rPr>
-              <w:t>2026-01</w:t>
+              <w:t>2026-0</w:t>
+            </w:r>
+            <w:r>
+              <w:rPr>
+                <w:lang w:val="de-CH"/>
+              </w:rPr>
+              <w:t>4</w:t>
             </w:r>
           </w:p>
         </w:tc>
@@ -880,12 +937,14 @@
                 <w:lang w:val="fr-CH"/>
               </w:rPr>
             </w:pPr>
+            <w:proofErr w:type="gramStart"/>
             <w:r>
               <w:rPr>
                 <w:lang w:val="fr-CH"/>
               </w:rPr>
               <w:t>tag:catalogue.qc.ebu.ch</w:t>
             </w:r>
+            <w:proofErr w:type="gramEnd"/>
             <w:r>
               <w:rPr>
                 <w:lang w:val="fr-CH"/>
@@ -896,7 +955,13 @@
               <w:rPr>
                 <w:lang w:val="fr-CH"/>
               </w:rPr>
-              <w:t>2026-01</w:t>
+              <w:t>2026-0</w:t>
+            </w:r>
+            <w:r>
+              <w:rPr>
+                <w:lang w:val="fr-CH"/>
+              </w:rPr>
+              <w:t>4</w:t>
             </w:r>
           </w:p>
         </w:tc>
@@ -924,7 +989,15 @@
         <w:t xml:space="preserve">provided to and returned by endpoints </w:t>
       </w:r>
       <w:r>
-        <w:t xml:space="preserve">shall be encoded using UTF-8 character encoding, as specified in </w:t>
+        <w:t>shall be encoded using UTF-</w:t>
+      </w:r>
+      <w:proofErr w:type="gramStart"/>
+      <w:r>
+        <w:t>8 character</w:t>
+      </w:r>
+      <w:proofErr w:type="gramEnd"/>
+      <w:r>
+        <w:t xml:space="preserve"> encoding, as specified in </w:t>
       </w:r>
       <w:r>
         <w:t>W3C XML</w:t>
@@ -1007,13 +1080,22 @@
         <w:pStyle w:val="SBodyTextBullet"/>
       </w:pPr>
       <w:r>
+        <w:lastRenderedPageBreak/>
         <w:t xml:space="preserve">301 Moved Permanently. Returned if the </w:t>
       </w:r>
       <w:r>
         <w:t>resource</w:t>
       </w:r>
       <w:r>
-        <w:t xml:space="preserve"> is no longer available at the request URI. The response shall contain a Location header containing the replacement request URI</w:t>
+        <w:t xml:space="preserve"> is no longer available at the </w:t>
+      </w:r>
+      <w:proofErr w:type="gramStart"/>
+      <w:r>
+        <w:t>request</w:t>
+      </w:r>
+      <w:proofErr w:type="gramEnd"/>
+      <w:r>
+        <w:t xml:space="preserve"> URI. The response shall contain a Location header containing the replacement request URI</w:t>
       </w:r>
       <w:r>
         <w:t xml:space="preserve"> path</w:t>
@@ -1027,508 +1109,605 @@
         <w:pStyle w:val="SBodyTextBullet"/>
       </w:pPr>
       <w:r>
+        <w:t xml:space="preserve">401 Unauthorized. In addition to </w:t>
+      </w:r>
+      <w:r>
+        <w:t xml:space="preserve">being returned as specified in </w:t>
+      </w:r>
+      <w:r>
+        <w:t>IETF RFC 7231</w:t>
+      </w:r>
+      <w:r>
+        <w:t>, i.e. returned if the Basic Authentication credentials are invalid, this status code is also returned if the client IP address is not authorized to access the resource.</w:t>
+      </w:r>
+    </w:p>
+    <w:p>
+      <w:pPr>
+        <w:pStyle w:val="SBodyTextBullet"/>
+      </w:pPr>
+      <w:r>
+        <w:t xml:space="preserve">404 Not Found. This status code is returned if an invalid </w:t>
+      </w:r>
+      <w:r>
+        <w:rPr>
+          <w:rStyle w:val="SKeyword"/>
+        </w:rPr>
+        <w:t>{</w:t>
+      </w:r>
+      <w:proofErr w:type="spellStart"/>
+      <w:r>
+        <w:rPr>
+          <w:rStyle w:val="SKeyword"/>
+        </w:rPr>
+        <w:t>apiV</w:t>
+      </w:r>
+      <w:r>
+        <w:rPr>
+          <w:rStyle w:val="SKeyword"/>
+        </w:rPr>
+        <w:t>ersion</w:t>
+      </w:r>
+      <w:proofErr w:type="spellEnd"/>
+      <w:r>
+        <w:rPr>
+          <w:rStyle w:val="SKeyword"/>
+        </w:rPr>
+        <w:t>}</w:t>
+      </w:r>
+      <w:r>
+        <w:t xml:space="preserve"> URI parameter is provided, i.e. an endpoint does not exist in the specified API version.</w:t>
+      </w:r>
+    </w:p>
+    <w:p>
+      <w:pPr>
+        <w:pStyle w:val="SBodyTextBullet"/>
+      </w:pPr>
+      <w:r>
+        <w:t xml:space="preserve">406 Not Acceptable. </w:t>
+      </w:r>
+      <w:r>
+        <w:t>Returned if the server cannot provide a response that matches one of content types listed in the</w:t>
+      </w:r>
+      <w:r>
+        <w:t xml:space="preserve"> </w:t>
+      </w:r>
+      <w:r>
+        <w:rPr>
+          <w:rStyle w:val="SKeyword"/>
+        </w:rPr>
+        <w:t>Accept</w:t>
+      </w:r>
+      <w:r>
+        <w:t xml:space="preserve"> </w:t>
+      </w:r>
+      <w:r>
+        <w:t xml:space="preserve">request </w:t>
+      </w:r>
+      <w:r>
+        <w:t>header</w:t>
+      </w:r>
+      <w:r>
+        <w:t>.</w:t>
+      </w:r>
+    </w:p>
+    <w:p>
+      <w:pPr>
+        <w:pStyle w:val="SBodyTextBullet"/>
+      </w:pPr>
+      <w:r>
+        <w:t>405 Method Not Allowed</w:t>
+      </w:r>
+      <w:r>
+        <w:t>. Returned if a request URI is not recognized by the server.</w:t>
+      </w:r>
+    </w:p>
+    <w:p>
+      <w:pPr>
+        <w:pStyle w:val="SBodyTextBullet"/>
+      </w:pPr>
+      <w:r>
+        <w:t>410 Gone. R</w:t>
+      </w:r>
+      <w:r>
+        <w:t>eturned i</w:t>
+      </w:r>
+      <w:r>
+        <w:t>f the resource is no longer available. The body of the response shall be empty.</w:t>
+      </w:r>
+    </w:p>
+    <w:p>
+      <w:pPr>
+        <w:pStyle w:val="SBodyTextBullet"/>
+      </w:pPr>
+      <w:r>
+        <w:t xml:space="preserve">415 Unsupported Media Type. Returned if the content type of the body, as indicated in </w:t>
+      </w:r>
+      <w:r>
+        <w:rPr>
+          <w:rStyle w:val="SKeyword"/>
+        </w:rPr>
+        <w:t>Content-Type</w:t>
+      </w:r>
+      <w:r>
+        <w:t xml:space="preserve"> </w:t>
+      </w:r>
+      <w:r>
+        <w:t xml:space="preserve">request header, </w:t>
+      </w:r>
+      <w:r>
+        <w:t>is not supported by the server.</w:t>
+      </w:r>
+    </w:p>
+    <w:p>
+      <w:pPr>
+        <w:pStyle w:val="SBodyTextBullet"/>
+      </w:pPr>
+      <w:r>
+        <w:t>408 Request Timed Out</w:t>
+      </w:r>
+    </w:p>
+    <w:p>
+      <w:pPr>
+        <w:pStyle w:val="SBodyTextBullet"/>
+      </w:pPr>
+      <w:r>
+        <w:t>429 Too Many Requests</w:t>
+      </w:r>
+    </w:p>
+    <w:p>
+      <w:pPr>
+        <w:pStyle w:val="SBodyTextBullet"/>
+      </w:pPr>
+      <w:r>
+        <w:t>500 Internal Server Error</w:t>
+      </w:r>
+    </w:p>
+    <w:p>
+      <w:pPr>
+        <w:pStyle w:val="SBodyTextBullet"/>
+      </w:pPr>
+      <w:r>
+        <w:t>502 Bad Gateway</w:t>
+      </w:r>
+    </w:p>
+    <w:p>
+      <w:pPr>
+        <w:pStyle w:val="SBodyTextBullet"/>
+      </w:pPr>
+      <w:r>
+        <w:t>503 Service Unavailable</w:t>
+      </w:r>
+    </w:p>
+    <w:p>
+      <w:pPr>
+        <w:pStyle w:val="SBodyTextBullet"/>
+      </w:pPr>
+      <w:r>
+        <w:t>504 Gateway Timeout</w:t>
+      </w:r>
+    </w:p>
+    <w:p>
+      <w:pPr>
+        <w:pStyle w:val="Heading2"/>
+      </w:pPr>
+      <w:r>
+        <w:t>URI Parameter Syntax</w:t>
+      </w:r>
+    </w:p>
+    <w:p>
+      <w:pPr>
+        <w:pStyle w:val="Heading3"/>
+      </w:pPr>
+      <w:r>
+        <w:t>id</w:t>
+      </w:r>
+    </w:p>
+    <w:p>
+      <w:pPr>
+        <w:pStyle w:val="BodyText"/>
+      </w:pPr>
+      <w:r>
+        <w:rPr>
+          <w:rStyle w:val="SKeyword"/>
+        </w:rPr>
+        <w:t>{id}</w:t>
+      </w:r>
+      <w:r>
+        <w:t xml:space="preserve"> shall conform to the syntax</w:t>
+      </w:r>
+      <w:r>
+        <w:t xml:space="preserve"> of</w:t>
+      </w:r>
+      <w:r>
+        <w:t xml:space="preserve"> the XML Schema type</w:t>
+      </w:r>
+      <w:r>
+        <w:t xml:space="preserve"> </w:t>
+      </w:r>
+      <w:proofErr w:type="spellStart"/>
+      <w:proofErr w:type="gramStart"/>
+      <w:r>
+        <w:rPr>
+          <w:rStyle w:val="SKeyword"/>
+        </w:rPr>
+        <w:t>qc:</w:t>
+      </w:r>
+      <w:r>
+        <w:rPr>
+          <w:rStyle w:val="SKeyword"/>
+        </w:rPr>
+        <w:t>EBUQCIDType</w:t>
+      </w:r>
+      <w:proofErr w:type="spellEnd"/>
+      <w:proofErr w:type="gramEnd"/>
+      <w:r>
+        <w:t>.</w:t>
+      </w:r>
+    </w:p>
+    <w:p>
+      <w:pPr>
+        <w:pStyle w:val="Heading3"/>
+      </w:pPr>
+      <w:bookmarkStart w:id="1" w:name="_Ref232695487"/>
+      <w:r>
+        <w:t>version</w:t>
+      </w:r>
+      <w:bookmarkEnd w:id="1"/>
+    </w:p>
+    <w:p>
+      <w:pPr>
+        <w:pStyle w:val="BodyText"/>
+      </w:pPr>
+      <w:r>
+        <w:rPr>
+          <w:rStyle w:val="SKeyword"/>
+        </w:rPr>
+        <w:t>{version}</w:t>
+      </w:r>
+      <w:r>
+        <w:t xml:space="preserve"> shall conform to the syntax</w:t>
+      </w:r>
+      <w:r>
+        <w:t xml:space="preserve"> </w:t>
+      </w:r>
+      <w:r>
+        <w:t>of the XML Schema type</w:t>
+      </w:r>
+      <w:r>
+        <w:t xml:space="preserve"> </w:t>
+      </w:r>
+      <w:proofErr w:type="spellStart"/>
+      <w:proofErr w:type="gramStart"/>
+      <w:r>
+        <w:rPr>
+          <w:rStyle w:val="SKeyword"/>
+        </w:rPr>
+        <w:t>qc:</w:t>
+      </w:r>
+      <w:r>
+        <w:rPr>
+          <w:rStyle w:val="SKeyword"/>
+        </w:rPr>
+        <w:t>EBUQCVersionType</w:t>
+      </w:r>
+      <w:proofErr w:type="spellEnd"/>
+      <w:proofErr w:type="gramEnd"/>
+      <w:r>
+        <w:t xml:space="preserve"> where the final numeric identifier (the "patch" portion) shall not be used.</w:t>
+      </w:r>
+    </w:p>
+    <w:p>
+      <w:pPr>
+        <w:pStyle w:val="BodyText"/>
+        <w:rPr>
+          <w:rFonts w:ascii="Courier New" w:hAnsi="Courier New"/>
+          <w:sz w:val="18"/>
+          <w:lang w:val="en-GB"/>
+        </w:rPr>
+      </w:pPr>
+      <w:r>
+        <w:t xml:space="preserve">Note: this means that </w:t>
+      </w:r>
+      <w:r>
+        <w:rPr>
+          <w:rStyle w:val="SKeyword"/>
+        </w:rPr>
+        <w:t>{version}</w:t>
+      </w:r>
+      <w:r>
+        <w:t xml:space="preserve"> must always be of the form</w:t>
+      </w:r>
+      <w:r>
+        <w:t xml:space="preserve"> </w:t>
+      </w:r>
+      <w:r>
+        <w:rPr>
+          <w:rFonts w:ascii="Courier New" w:hAnsi="Courier New"/>
+          <w:sz w:val="18"/>
+          <w:lang w:val="en-GB"/>
+        </w:rPr>
+        <w:t>&lt;major&gt; "." &lt;minor&gt;</w:t>
+      </w:r>
+      <w:r>
+        <w:rPr>
+          <w:lang w:val="en-GB"/>
+        </w:rPr>
+        <w:t xml:space="preserve"> and never of the form</w:t>
+      </w:r>
+      <w:r>
+        <w:rPr>
+          <w:rFonts w:ascii="Courier New" w:hAnsi="Courier New"/>
+          <w:sz w:val="18"/>
+          <w:lang w:val="en-GB"/>
+        </w:rPr>
+        <w:t xml:space="preserve"> </w:t>
+      </w:r>
+      <w:r>
+        <w:rPr>
+          <w:rFonts w:ascii="Courier New" w:hAnsi="Courier New"/>
+          <w:sz w:val="18"/>
+          <w:lang w:val="en-GB"/>
+        </w:rPr>
+        <w:t>&lt;major&gt; "." &lt;minor&gt; "." &lt;patch&gt;</w:t>
+      </w:r>
+      <w:r>
+        <w:rPr>
+          <w:lang w:val="en-GB"/>
+        </w:rPr>
+        <w:t>. For example, "3.2" is valid and "3.2.0" is invalid.</w:t>
+      </w:r>
+    </w:p>
+    <w:p>
+      <w:pPr>
+        <w:pStyle w:val="Heading2"/>
+      </w:pPr>
+      <w:r>
+        <w:t>XML Types</w:t>
+      </w:r>
+    </w:p>
+    <w:p>
+      <w:pPr>
+        <w:pStyle w:val="Heading3"/>
+        <w:rPr>
+          <w:lang w:val="en-US"/>
+        </w:rPr>
+      </w:pPr>
+      <w:r>
+        <w:rPr>
+          <w:lang w:val="en-US"/>
+        </w:rPr>
+        <w:t>General</w:t>
+      </w:r>
+    </w:p>
+    <w:p>
+      <w:r>
+        <w:rPr>
+          <w:lang w:eastAsia="x-none"/>
+        </w:rPr>
+        <w:t>The following specifies semantics for XML Schema definitions used by the API.</w:t>
+      </w:r>
+    </w:p>
+    <w:p>
+      <w:pPr>
+        <w:pStyle w:val="Heading3"/>
+        <w:rPr>
+          <w:lang w:val="en-US"/>
+        </w:rPr>
+      </w:pPr>
+      <w:r>
+        <w:rPr>
+          <w:lang w:val="en-US"/>
+        </w:rPr>
         <w:lastRenderedPageBreak/>
-        <w:t xml:space="preserve">401 Unauthorized. In addition to </w:t>
-      </w:r>
-      <w:r>
-        <w:t xml:space="preserve">being returned as specified in </w:t>
-      </w:r>
-      <w:r>
-        <w:t>IETF RFC 7231</w:t>
-      </w:r>
-      <w:r>
-        <w:t>, i.e. returned if the Basic Authentication credentials are invalid, this status code is also returned if the client IP address is not authorized to access the resource.</w:t>
-      </w:r>
-    </w:p>
-    <w:p>
-      <w:pPr>
-        <w:pStyle w:val="SBodyTextBullet"/>
-      </w:pPr>
-      <w:r>
-        <w:t xml:space="preserve">404 Not Found. This status code is returned if an invalid </w:t>
-      </w:r>
-      <w:r>
-        <w:rPr>
-          <w:rStyle w:val="SKeyword"/>
-        </w:rPr>
-        <w:t>{</w:t>
-      </w:r>
+        <w:t>ItemInfo</w:t>
+      </w:r>
+    </w:p>
+    <w:p>
+      <w:pPr>
+        <w:pStyle w:val="Heading4"/>
+        <w:rPr>
+          <w:lang w:val="en-US"/>
+        </w:rPr>
+      </w:pPr>
+      <w:r>
+        <w:t>General</w:t>
+      </w:r>
+    </w:p>
+    <w:p>
+      <w:r>
+        <w:rPr>
+          <w:lang w:eastAsia="x-none"/>
+        </w:rPr>
+        <w:t xml:space="preserve">The </w:t>
+      </w:r>
+      <w:r>
+        <w:rPr>
+          <w:rStyle w:val="SKeyword"/>
+        </w:rPr>
+        <w:t>ItemInfo</w:t>
+      </w:r>
+      <w:r>
+        <w:rPr>
+          <w:lang w:eastAsia="x-none"/>
+        </w:rPr>
+        <w:t xml:space="preserve"> element represents a </w:t>
+      </w:r>
+      <w:r>
+        <w:rPr>
+          <w:lang w:eastAsia="x-none"/>
+        </w:rPr>
+        <w:t xml:space="preserve">version of a </w:t>
+      </w:r>
+      <w:r>
+        <w:rPr>
+          <w:lang w:eastAsia="x-none"/>
+        </w:rPr>
+        <w:t>single item in the catalog</w:t>
+      </w:r>
+      <w:r>
+        <w:rPr>
+          <w:lang w:eastAsia="x-none"/>
+        </w:rPr>
+        <w:t>ue</w:t>
+      </w:r>
+      <w:r>
+        <w:rPr>
+          <w:lang w:eastAsia="x-none"/>
+        </w:rPr>
+        <w:t>.</w:t>
+      </w:r>
+    </w:p>
+    <w:p>
+      <w:pPr>
+        <w:pStyle w:val="Heading4"/>
+        <w:rPr>
+          <w:lang w:val="en-US"/>
+        </w:rPr>
+      </w:pPr>
       <w:proofErr w:type="spellStart"/>
       <w:r>
         <w:rPr>
-          <w:rStyle w:val="SKeyword"/>
-        </w:rPr>
-        <w:t>apiV</w:t>
-      </w:r>
-      <w:r>
-        <w:rPr>
-          <w:rStyle w:val="SKeyword"/>
-        </w:rPr>
-        <w:t>ersion</w:t>
+          <w:lang w:val="en-US"/>
+        </w:rPr>
+        <w:t>ThisVersion</w:t>
       </w:r>
       <w:proofErr w:type="spellEnd"/>
-      <w:r>
-        <w:rPr>
-          <w:rStyle w:val="SKeyword"/>
-        </w:rPr>
-        <w:t>}</w:t>
-      </w:r>
-      <w:r>
-        <w:t xml:space="preserve"> URI parameter is provided, i.e. an endpoint does not exist in the specified API version.</w:t>
-      </w:r>
-    </w:p>
-    <w:p>
-      <w:pPr>
-        <w:pStyle w:val="SBodyTextBullet"/>
-      </w:pPr>
-      <w:r>
-        <w:t xml:space="preserve">406 Not Acceptable. </w:t>
-      </w:r>
-      <w:r>
-        <w:t>Returned if the server cannot provide a response that matches one of content types listed in the</w:t>
+    </w:p>
+    <w:p>
+      <w:r>
+        <w:rPr>
+          <w:lang w:eastAsia="x-none"/>
+        </w:rPr>
+        <w:t xml:space="preserve">The </w:t>
+      </w:r>
+      <w:proofErr w:type="spellStart"/>
+      <w:r>
+        <w:rPr>
+          <w:rStyle w:val="SKeyword"/>
+        </w:rPr>
+        <w:t>ThisVersion</w:t>
+      </w:r>
+      <w:proofErr w:type="spellEnd"/>
+      <w:r>
+        <w:rPr>
+          <w:lang w:eastAsia="x-none"/>
+        </w:rPr>
+        <w:t xml:space="preserve"> element </w:t>
+      </w:r>
+      <w:r>
+        <w:rPr>
+          <w:lang w:eastAsia="x-none"/>
+        </w:rPr>
+        <w:t>contains the</w:t>
       </w:r>
       <w:r>
         <w:t xml:space="preserve"> </w:t>
       </w:r>
-      <w:r>
-        <w:rPr>
-          <w:rStyle w:val="SKeyword"/>
-        </w:rPr>
-        <w:t>Accept</w:t>
-      </w:r>
-      <w:r>
-        <w:t xml:space="preserve"> </w:t>
-      </w:r>
-      <w:r>
-        <w:t xml:space="preserve">request </w:t>
-      </w:r>
-      <w:r>
-        <w:t>header</w:t>
-      </w:r>
-      <w:r>
+      <w:proofErr w:type="spellStart"/>
+      <w:r>
+        <w:rPr>
+          <w:rStyle w:val="SKeyword"/>
+        </w:rPr>
+        <w:t>EBUQCVersion</w:t>
+      </w:r>
+      <w:proofErr w:type="spellEnd"/>
+      <w:r>
+        <w:t xml:space="preserve"> property </w:t>
+      </w:r>
+      <w:r>
+        <w:rPr>
+          <w:lang w:eastAsia="x-none"/>
+        </w:rPr>
+        <w:t xml:space="preserve">of </w:t>
+      </w:r>
+      <w:r>
+        <w:rPr>
+          <w:lang w:eastAsia="x-none"/>
+        </w:rPr>
+        <w:t xml:space="preserve">the </w:t>
+      </w:r>
+      <w:r>
+        <w:rPr>
+          <w:lang w:eastAsia="x-none"/>
+        </w:rPr>
+        <w:t>item</w:t>
+      </w:r>
+      <w:r>
+        <w:rPr>
+          <w:lang w:eastAsia="x-none"/>
+        </w:rPr>
+        <w:t xml:space="preserve"> version represented by the response</w:t>
+      </w:r>
+      <w:r>
+        <w:rPr>
+          <w:lang w:eastAsia="x-none"/>
+        </w:rPr>
         <w:t>.</w:t>
       </w:r>
     </w:p>
     <w:p>
       <w:pPr>
-        <w:pStyle w:val="SBodyTextBullet"/>
-      </w:pPr>
-      <w:r>
-        <w:t>405 Method Not Allowed</w:t>
-      </w:r>
-      <w:r>
-        <w:t>. Returned if a request URI is not recognized by the server.</w:t>
-      </w:r>
-    </w:p>
-    <w:p>
-      <w:pPr>
-        <w:pStyle w:val="SBodyTextBullet"/>
-      </w:pPr>
-      <w:r>
-        <w:t>410 Gone. R</w:t>
-      </w:r>
-      <w:r>
-        <w:t>eturned i</w:t>
-      </w:r>
-      <w:r>
-        <w:t>f the resource is no longer available. The body of the response shall be empty.</w:t>
-      </w:r>
-    </w:p>
-    <w:p>
-      <w:pPr>
-        <w:pStyle w:val="SBodyTextBullet"/>
-      </w:pPr>
-      <w:r>
-        <w:t xml:space="preserve">415 Unsupported Media Type. Returned if the content type of the body, as indicated in </w:t>
-      </w:r>
-      <w:r>
-        <w:rPr>
-          <w:rStyle w:val="SKeyword"/>
-        </w:rPr>
-        <w:t>Content-Type</w:t>
-      </w:r>
-      <w:r>
-        <w:t xml:space="preserve"> </w:t>
-      </w:r>
-      <w:r>
-        <w:t xml:space="preserve">request header, </w:t>
-      </w:r>
-      <w:r>
-        <w:t>is not supported by the server.</w:t>
-      </w:r>
-    </w:p>
-    <w:p>
-      <w:pPr>
-        <w:pStyle w:val="SBodyTextBullet"/>
-      </w:pPr>
-      <w:r>
-        <w:t>408 Request Timed Out</w:t>
-      </w:r>
-    </w:p>
-    <w:p>
-      <w:pPr>
-        <w:pStyle w:val="SBodyTextBullet"/>
-      </w:pPr>
-      <w:r>
-        <w:t>429 Too Many Requests</w:t>
-      </w:r>
-    </w:p>
-    <w:p>
-      <w:pPr>
-        <w:pStyle w:val="SBodyTextBullet"/>
-      </w:pPr>
-      <w:r>
-        <w:t>500 Internal Server Error</w:t>
-      </w:r>
-    </w:p>
-    <w:p>
-      <w:pPr>
-        <w:pStyle w:val="SBodyTextBullet"/>
-      </w:pPr>
-      <w:r>
-        <w:t>502 Bad Gateway</w:t>
-      </w:r>
-    </w:p>
-    <w:p>
-      <w:pPr>
-        <w:pStyle w:val="SBodyTextBullet"/>
-      </w:pPr>
-      <w:r>
-        <w:t>503 Service Unavailable</w:t>
-      </w:r>
-    </w:p>
-    <w:p>
-      <w:pPr>
-        <w:pStyle w:val="SBodyTextBullet"/>
-      </w:pPr>
-      <w:r>
-        <w:t>504 Gateway Timeout</w:t>
-      </w:r>
-    </w:p>
-    <w:p>
-      <w:pPr>
-        <w:pStyle w:val="Heading2"/>
-      </w:pPr>
-      <w:r>
-        <w:t>URI Parameter Syntax</w:t>
-      </w:r>
-    </w:p>
-    <w:p>
-      <w:pPr>
-        <w:pStyle w:val="Heading3"/>
-      </w:pPr>
-      <w:r>
-        <w:t>id</w:t>
-      </w:r>
-    </w:p>
-    <w:p>
-      <w:pPr>
-        <w:pStyle w:val="BodyText"/>
-      </w:pPr>
-      <w:r>
-        <w:rPr>
-          <w:rStyle w:val="SKeyword"/>
-        </w:rPr>
-        <w:t>{id}</w:t>
-      </w:r>
-      <w:r>
-        <w:t xml:space="preserve"> shall conform to the syntax</w:t>
-      </w:r>
-      <w:r>
-        <w:t xml:space="preserve"> of</w:t>
-      </w:r>
-      <w:r>
-        <w:t xml:space="preserve"> the XML Schema type</w:t>
-      </w:r>
-      <w:r>
-        <w:t xml:space="preserve"> </w:t>
+        <w:pStyle w:val="Heading4"/>
+        <w:rPr>
+          <w:lang w:val="en-US"/>
+        </w:rPr>
+      </w:pPr>
+      <w:r>
+        <w:rPr>
+          <w:lang w:val="en-US"/>
+        </w:rPr>
+        <w:t>Versions</w:t>
+      </w:r>
+    </w:p>
+    <w:p>
+      <w:pPr>
+        <w:rPr>
+          <w:rFonts w:ascii="Courier New" w:hAnsi="Courier New"/>
+          <w:sz w:val="18"/>
+        </w:rPr>
+      </w:pPr>
+      <w:r>
+        <w:t xml:space="preserve">The </w:t>
+      </w:r>
+      <w:r>
+        <w:rPr>
+          <w:rStyle w:val="SKeyword"/>
+        </w:rPr>
+        <w:t>Versions</w:t>
+      </w:r>
+      <w:r>
+        <w:t xml:space="preserve"> element lists the </w:t>
       </w:r>
       <w:proofErr w:type="spellStart"/>
       <w:r>
         <w:rPr>
           <w:rStyle w:val="SKeyword"/>
         </w:rPr>
-        <w:t>qc:</w:t>
-      </w:r>
-      <w:r>
-        <w:rPr>
-          <w:rStyle w:val="SKeyword"/>
-        </w:rPr>
-        <w:t>EBUQCIDType</w:t>
+        <w:t>EBUQCVersion</w:t>
       </w:r>
       <w:proofErr w:type="spellEnd"/>
       <w:r>
+        <w:t xml:space="preserve"> property of all versions of the item</w:t>
+      </w:r>
+      <w:r>
+        <w:t xml:space="preserve"> that have a </w:t>
+      </w:r>
+      <w:r>
+        <w:rPr>
+          <w:rStyle w:val="SKeyword"/>
+        </w:rPr>
+        <w:t>Status</w:t>
+      </w:r>
+      <w:r>
+        <w:t xml:space="preserve"> o</w:t>
+      </w:r>
+      <w:r>
+        <w:t>f either "published" or "withdrawn"</w:t>
+      </w:r>
+      <w:r>
         <w:t>.</w:t>
       </w:r>
     </w:p>
-    <w:p>
-      <w:pPr>
-        <w:pStyle w:val="Heading3"/>
-      </w:pPr>
-      <w:r>
-        <w:t>version</w:t>
-      </w:r>
-    </w:p>
-    <w:p>
-      <w:pPr>
-        <w:pStyle w:val="BodyText"/>
-      </w:pPr>
-      <w:r>
-        <w:rPr>
-          <w:rStyle w:val="SKeyword"/>
-        </w:rPr>
-        <w:t>{version}</w:t>
-      </w:r>
-      <w:r>
-        <w:t xml:space="preserve"> shall conform to the syntax</w:t>
-      </w:r>
-      <w:r>
-        <w:t xml:space="preserve"> </w:t>
-      </w:r>
-      <w:r>
-        <w:t>of the XML Schema type</w:t>
-      </w:r>
-      <w:r>
-        <w:t xml:space="preserve"> </w:t>
-      </w:r>
-      <w:proofErr w:type="spellStart"/>
-      <w:r>
-        <w:rPr>
-          <w:rStyle w:val="SKeyword"/>
-        </w:rPr>
-        <w:t>qc:</w:t>
-      </w:r>
-      <w:r>
-        <w:rPr>
-          <w:rStyle w:val="SKeyword"/>
-        </w:rPr>
-        <w:t>EBUQCVersionType</w:t>
-      </w:r>
-      <w:proofErr w:type="spellEnd"/>
-      <w:r>
-        <w:t>.</w:t>
-      </w:r>
-    </w:p>
-    <w:p>
-      <w:pPr>
-        <w:pStyle w:val="Heading2"/>
-      </w:pPr>
-      <w:r>
-        <w:t>XML Types</w:t>
-      </w:r>
-    </w:p>
-    <w:p>
-      <w:pPr>
-        <w:pStyle w:val="Heading3"/>
-        <w:rPr>
-          <w:lang w:val="en-US"/>
-        </w:rPr>
-      </w:pPr>
-      <w:r>
-        <w:rPr>
-          <w:lang w:val="en-US"/>
-        </w:rPr>
-        <w:t>General</w:t>
-      </w:r>
-    </w:p>
-    <w:p>
-      <w:r>
-        <w:rPr>
-          <w:lang w:eastAsia="x-none"/>
-        </w:rPr>
-        <w:t>The following specifies semantics for XML Schema definitions used by the API.</w:t>
-      </w:r>
-    </w:p>
-    <w:p>
-      <w:pPr>
-        <w:pStyle w:val="Heading3"/>
-        <w:rPr>
-          <w:lang w:val="en-US"/>
-        </w:rPr>
-      </w:pPr>
-      <w:proofErr w:type="spellStart"/>
-      <w:r>
-        <w:rPr>
-          <w:lang w:val="en-US"/>
-        </w:rPr>
-        <w:t>ItemInfo</w:t>
-      </w:r>
-      <w:proofErr w:type="spellEnd"/>
-    </w:p>
-    <w:p>
-      <w:pPr>
-        <w:pStyle w:val="Heading4"/>
-        <w:rPr>
-          <w:lang w:val="en-US"/>
-        </w:rPr>
-      </w:pPr>
-      <w:r>
-        <w:t>General</w:t>
-      </w:r>
-    </w:p>
-    <w:p>
-      <w:r>
-        <w:rPr>
-          <w:lang w:eastAsia="x-none"/>
-        </w:rPr>
-        <w:t xml:space="preserve">The </w:t>
-      </w:r>
-      <w:proofErr w:type="spellStart"/>
-      <w:r>
-        <w:rPr>
-          <w:rStyle w:val="SKeyword"/>
-        </w:rPr>
-        <w:t>ItemInfo</w:t>
-      </w:r>
-      <w:proofErr w:type="spellEnd"/>
-      <w:r>
-        <w:rPr>
-          <w:lang w:eastAsia="x-none"/>
-        </w:rPr>
-        <w:t xml:space="preserve"> element represents a </w:t>
-      </w:r>
-      <w:r>
-        <w:rPr>
-          <w:lang w:eastAsia="x-none"/>
-        </w:rPr>
-        <w:t xml:space="preserve">version of a </w:t>
-      </w:r>
-      <w:r>
-        <w:rPr>
-          <w:lang w:eastAsia="x-none"/>
-        </w:rPr>
-        <w:t>single item in the catalog</w:t>
-      </w:r>
-      <w:r>
-        <w:rPr>
-          <w:lang w:eastAsia="x-none"/>
-        </w:rPr>
-        <w:t>ue</w:t>
-      </w:r>
-      <w:r>
-        <w:rPr>
-          <w:lang w:eastAsia="x-none"/>
-        </w:rPr>
-        <w:t>.</w:t>
-      </w:r>
-    </w:p>
-    <w:p>
-      <w:pPr>
-        <w:pStyle w:val="Heading4"/>
-        <w:rPr>
-          <w:lang w:val="en-US"/>
-        </w:rPr>
-      </w:pPr>
-      <w:proofErr w:type="spellStart"/>
-      <w:r>
-        <w:rPr>
-          <w:lang w:val="en-US"/>
-        </w:rPr>
-        <w:t>ThisVersion</w:t>
-      </w:r>
-      <w:proofErr w:type="spellEnd"/>
-    </w:p>
-    <w:p>
-      <w:r>
-        <w:rPr>
-          <w:lang w:eastAsia="x-none"/>
-        </w:rPr>
-        <w:t xml:space="preserve">The </w:t>
-      </w:r>
-      <w:proofErr w:type="spellStart"/>
-      <w:r>
-        <w:rPr>
-          <w:rStyle w:val="SKeyword"/>
-        </w:rPr>
-        <w:t>ThisVersion</w:t>
-      </w:r>
-      <w:proofErr w:type="spellEnd"/>
-      <w:r>
-        <w:rPr>
-          <w:lang w:eastAsia="x-none"/>
-        </w:rPr>
-        <w:t xml:space="preserve"> element </w:t>
-      </w:r>
-      <w:r>
-        <w:rPr>
-          <w:lang w:eastAsia="x-none"/>
-        </w:rPr>
-        <w:t>contains the</w:t>
-      </w:r>
-      <w:r>
-        <w:t xml:space="preserve"> </w:t>
-      </w:r>
-      <w:proofErr w:type="spellStart"/>
-      <w:r>
-        <w:rPr>
-          <w:rStyle w:val="SKeyword"/>
-        </w:rPr>
-        <w:t>EBUQCVersion</w:t>
-      </w:r>
-      <w:proofErr w:type="spellEnd"/>
-      <w:r>
-        <w:t xml:space="preserve"> property </w:t>
-      </w:r>
-      <w:r>
-        <w:rPr>
-          <w:lang w:eastAsia="x-none"/>
-        </w:rPr>
-        <w:t xml:space="preserve">of </w:t>
-      </w:r>
-      <w:r>
-        <w:rPr>
-          <w:lang w:eastAsia="x-none"/>
-        </w:rPr>
-        <w:t>a published version of the</w:t>
-      </w:r>
-      <w:r>
-        <w:rPr>
-          <w:lang w:eastAsia="x-none"/>
-        </w:rPr>
-        <w:t xml:space="preserve"> item.</w:t>
-      </w:r>
-    </w:p>
-    <w:p>
-      <w:pPr>
-        <w:pStyle w:val="Heading4"/>
-        <w:rPr>
-          <w:lang w:val="en-US"/>
-        </w:rPr>
-      </w:pPr>
-      <w:r>
-        <w:rPr>
-          <w:lang w:val="en-US"/>
-        </w:rPr>
-        <w:lastRenderedPageBreak/>
-        <w:t>Versions</w:t>
-      </w:r>
-    </w:p>
-    <w:p>
-      <w:r>
-        <w:t xml:space="preserve">The </w:t>
-      </w:r>
-      <w:r>
-        <w:rPr>
-          <w:rStyle w:val="SKeyword"/>
-        </w:rPr>
-        <w:t>Versions</w:t>
-      </w:r>
-      <w:r>
-        <w:t xml:space="preserve"> element lists the </w:t>
-      </w:r>
-      <w:proofErr w:type="spellStart"/>
-      <w:r>
-        <w:rPr>
-          <w:rStyle w:val="SKeyword"/>
-        </w:rPr>
-        <w:t>EBUQCVersion</w:t>
-      </w:r>
-      <w:proofErr w:type="spellEnd"/>
-      <w:r>
-        <w:t xml:space="preserve"> property of all published versions of the item.</w:t>
-      </w:r>
-    </w:p>
-    <w:p/>
     <w:p>
       <w:pPr>
         <w:pStyle w:val="Heading4"/>
@@ -1603,19 +1782,32 @@
       <w:pPr>
         <w:pStyle w:val="Caption"/>
       </w:pPr>
-      <w:bookmarkStart w:id="1" w:name="_Ref495059954"/>
+      <w:bookmarkStart w:id="2" w:name="_Ref495059954"/>
       <w:r>
         <w:t xml:space="preserve">Figure </w:t>
       </w:r>
-      <w:fldSimple w:instr=" SEQ Figure \* ARABIC ">
-        <w:r>
-          <w:rPr>
-            <w:noProof/>
-          </w:rPr>
-          <w:t>1</w:t>
-        </w:r>
-      </w:fldSimple>
-      <w:bookmarkEnd w:id="1"/>
+      <w:r>
+        <w:fldChar w:fldCharType="begin"/>
+      </w:r>
+      <w:r>
+        <w:instrText xml:space="preserve"> SEQ Figure \* ARABIC </w:instrText>
+      </w:r>
+      <w:r>
+        <w:fldChar w:fldCharType="separate"/>
+      </w:r>
+      <w:r>
+        <w:rPr>
+          <w:noProof/>
+        </w:rPr>
+        <w:t>1</w:t>
+      </w:r>
+      <w:r>
+        <w:rPr>
+          <w:noProof/>
+        </w:rPr>
+        <w:fldChar w:fldCharType="end"/>
+      </w:r>
+      <w:bookmarkEnd w:id="2"/>
       <w:r>
         <w:t>. Pictorial Representation of a catalog</w:t>
       </w:r>
@@ -1776,6 +1968,7 @@
         <w:pStyle w:val="BodyText"/>
       </w:pPr>
       <w:r>
+        <w:lastRenderedPageBreak/>
         <w:t xml:space="preserve">The </w:t>
       </w:r>
       <w:r>
@@ -1912,7 +2105,6 @@
         <w:pStyle w:val="BodyText"/>
       </w:pPr>
       <w:r>
-        <w:lastRenderedPageBreak/>
         <w:t xml:space="preserve">For both the </w:t>
       </w:r>
       <w:r>
@@ -2013,6 +2205,78 @@
     </w:p>
     <w:p>
       <w:pPr>
+        <w:pStyle w:val="BodyText"/>
+      </w:pPr>
+      <w:r>
+        <w:t xml:space="preserve">The </w:t>
+      </w:r>
+      <w:proofErr w:type="spellStart"/>
+      <w:r>
+        <w:rPr>
+          <w:rStyle w:val="SKeyword"/>
+        </w:rPr>
+        <w:t>EBUQCVersion</w:t>
+      </w:r>
+      <w:proofErr w:type="spellEnd"/>
+      <w:r>
+        <w:t xml:space="preserve"> element of </w:t>
+      </w:r>
+      <w:r>
+        <w:rPr>
+          <w:rStyle w:val="SKeyword"/>
+        </w:rPr>
+        <w:t>Item</w:t>
+      </w:r>
+      <w:r>
+        <w:t xml:space="preserve"> shall be formatted in the same manner as </w:t>
+      </w:r>
+      <w:r>
+        <w:rPr>
+          <w:rStyle w:val="SKeyword"/>
+        </w:rPr>
+        <w:t>{version}</w:t>
+      </w:r>
+      <w:r>
+        <w:t xml:space="preserve"> (see Section </w:t>
+      </w:r>
+      <w:r>
+        <w:fldChar w:fldCharType="begin"/>
+      </w:r>
+      <w:r>
+        <w:instrText xml:space="preserve"> REF _Ref232695487 \r \h </w:instrText>
+      </w:r>
+      <w:r>
+        <w:instrText xml:space="preserve"> \* MERGEFORMAT </w:instrText>
+      </w:r>
+      <w:r>
+        <w:fldChar w:fldCharType="separate"/>
+      </w:r>
+      <w:r>
+        <w:t>3.6.2</w:t>
+      </w:r>
+      <w:r>
+        <w:fldChar w:fldCharType="end"/>
+      </w:r>
+      <w:r>
+        <w:t>)</w:t>
+      </w:r>
+      <w:r>
+        <w:t xml:space="preserve"> and shall match the value of </w:t>
+      </w:r>
+      <w:proofErr w:type="spellStart"/>
+      <w:r>
+        <w:rPr>
+          <w:rStyle w:val="SKeyword"/>
+        </w:rPr>
+        <w:t>ThisVersion</w:t>
+      </w:r>
+      <w:proofErr w:type="spellEnd"/>
+      <w:r>
+        <w:t>.</w:t>
+      </w:r>
+    </w:p>
+    <w:p>
+      <w:pPr>
         <w:pStyle w:val="Heading1"/>
       </w:pPr>
       <w:r>
@@ -2026,12 +2290,12 @@
       <w:pPr>
         <w:pStyle w:val="Heading2"/>
       </w:pPr>
-      <w:bookmarkStart w:id="2" w:name="_Ref483548139"/>
+      <w:bookmarkStart w:id="3" w:name="_Ref483548139"/>
       <w:proofErr w:type="spellStart"/>
       <w:r>
         <w:t>GetItems</w:t>
       </w:r>
-      <w:bookmarkEnd w:id="2"/>
+      <w:bookmarkEnd w:id="3"/>
       <w:proofErr w:type="spellEnd"/>
     </w:p>
     <w:p>
@@ -2056,16 +2320,49 @@
         <w:t xml:space="preserve"> retrieves </w:t>
       </w:r>
       <w:r>
-        <w:t>a list of all versions of all</w:t>
-      </w:r>
-      <w:r>
-        <w:t xml:space="preserve"> items in the catalog</w:t>
+        <w:t xml:space="preserve">a list of all </w:t>
+      </w:r>
+      <w:r>
+        <w:t>items in the catalog</w:t>
       </w:r>
       <w:r>
         <w:t>ue</w:t>
       </w:r>
       <w:r>
+        <w:t xml:space="preserve"> that have at least one version with a </w:t>
+      </w:r>
+      <w:r>
+        <w:rPr>
+          <w:rStyle w:val="SKeyword"/>
+        </w:rPr>
+        <w:t>Status</w:t>
+      </w:r>
+      <w:r>
+        <w:t xml:space="preserve"> of "published"</w:t>
+      </w:r>
+      <w:r>
         <w:t>.</w:t>
+      </w:r>
+      <w:r>
+        <w:t xml:space="preserve"> Details </w:t>
+      </w:r>
+      <w:r>
+        <w:t xml:space="preserve">are provided </w:t>
+      </w:r>
+      <w:r>
+        <w:t xml:space="preserve">of the </w:t>
+      </w:r>
+      <w:r>
+        <w:t>latest "published" or "withdrawn"</w:t>
+      </w:r>
+      <w:r>
+        <w:t xml:space="preserve"> </w:t>
+      </w:r>
+      <w:r>
+        <w:t>version</w:t>
+      </w:r>
+      <w:r>
+        <w:t xml:space="preserve"> of each item.</w:t>
       </w:r>
     </w:p>
     <w:p>
@@ -2163,7 +2460,10 @@
         <w:t xml:space="preserve"> {</w:t>
       </w:r>
       <w:r>
-        <w:t>uri-base}/items</w:t>
+        <w:t>baseURI</w:t>
+      </w:r>
+      <w:r>
+        <w:t>}/items</w:t>
       </w:r>
     </w:p>
     <w:p>
@@ -2178,8 +2478,13 @@
       <w:pPr>
         <w:pStyle w:val="BodyText"/>
       </w:pPr>
-      <w:r>
-        <w:t>No body shall be present.</w:t>
+      <w:proofErr w:type="gramStart"/>
+      <w:r>
+        <w:t>No body</w:t>
+      </w:r>
+      <w:proofErr w:type="gramEnd"/>
+      <w:r>
+        <w:t xml:space="preserve"> shall be present.</w:t>
       </w:r>
     </w:p>
     <w:p>
@@ -2190,6 +2495,7 @@
         </w:rPr>
       </w:pPr>
       <w:r>
+        <w:lastRenderedPageBreak/>
         <w:t>Response</w:t>
       </w:r>
       <w:r>
@@ -2242,7 +2548,7 @@
         <w:pStyle w:val="BodyText"/>
       </w:pPr>
       <w:r>
-        <w:t xml:space="preserve">Each </w:t>
+        <w:t xml:space="preserve">There shall be one </w:t>
       </w:r>
       <w:r>
         <w:t>/</w:t>
@@ -2251,57 +2557,499 @@
         <w:rPr>
           <w:rStyle w:val="SKeyword"/>
         </w:rPr>
-        <w:t>Items/</w:t>
+        <w:t>Items/ItemInfo</w:t>
+      </w:r>
+      <w:r>
+        <w:t xml:space="preserve"> element</w:t>
+      </w:r>
+      <w:r>
+        <w:t xml:space="preserve"> for each item in the catalogue that has </w:t>
+      </w:r>
+      <w:r>
+        <w:t xml:space="preserve">at least one version with a </w:t>
+      </w:r>
+      <w:r>
+        <w:rPr>
+          <w:rStyle w:val="SKeyword"/>
+        </w:rPr>
+        <w:t>Status</w:t>
+      </w:r>
+      <w:r>
+        <w:t xml:space="preserve"> of "published".</w:t>
+      </w:r>
+    </w:p>
+    <w:p>
+      <w:pPr>
+        <w:pStyle w:val="BodyText"/>
+      </w:pPr>
+      <w:r>
+        <w:t xml:space="preserve">For each </w:t>
+      </w:r>
+      <w:r>
+        <w:rPr>
+          <w:rStyle w:val="SKeyword"/>
+        </w:rPr>
+        <w:t>ItemInfo</w:t>
+      </w:r>
+      <w:r>
+        <w:t xml:space="preserve"> element</w:t>
+      </w:r>
+      <w:r>
+        <w:t>:</w:t>
+      </w:r>
+    </w:p>
+    <w:p>
+      <w:pPr>
+        <w:pStyle w:val="BodyText"/>
+        <w:numPr>
+          <w:ilvl w:val="0"/>
+          <w:numId w:val="28"/>
+        </w:numPr>
+      </w:pPr>
+      <w:r>
+        <w:t xml:space="preserve">The </w:t>
+      </w:r>
+      <w:r>
+        <w:rPr>
+          <w:rStyle w:val="SKeyword"/>
+        </w:rPr>
+        <w:t>Versions</w:t>
+      </w:r>
+      <w:r>
+        <w:t xml:space="preserve"> element </w:t>
+      </w:r>
+      <w:r>
+        <w:t xml:space="preserve">shall </w:t>
+      </w:r>
+      <w:r>
+        <w:t xml:space="preserve">list the </w:t>
       </w:r>
       <w:proofErr w:type="spellStart"/>
       <w:r>
         <w:rPr>
           <w:rStyle w:val="SKeyword"/>
         </w:rPr>
+        <w:t>EBUQCVersion</w:t>
+      </w:r>
+      <w:proofErr w:type="spellEnd"/>
+      <w:r>
+        <w:t xml:space="preserve"> property of all versions of the item that have a </w:t>
+      </w:r>
+      <w:r>
+        <w:rPr>
+          <w:rStyle w:val="SKeyword"/>
+        </w:rPr>
+        <w:t>Status</w:t>
+      </w:r>
+      <w:r>
+        <w:t xml:space="preserve"> of either "published" or "withdrawn"</w:t>
+      </w:r>
+      <w:r>
+        <w:t>.</w:t>
+      </w:r>
+    </w:p>
+    <w:p>
+      <w:pPr>
+        <w:pStyle w:val="BodyText"/>
+        <w:numPr>
+          <w:ilvl w:val="0"/>
+          <w:numId w:val="28"/>
+        </w:numPr>
+      </w:pPr>
+      <w:r>
+        <w:t xml:space="preserve">The </w:t>
+      </w:r>
+      <w:r>
+        <w:rPr>
+          <w:rStyle w:val="SKeyword"/>
+        </w:rPr>
         <w:t>ItemInfo</w:t>
       </w:r>
+      <w:r>
+        <w:t xml:space="preserve"> </w:t>
+      </w:r>
+      <w:r>
+        <w:t>element shall describe the item version</w:t>
+      </w:r>
+      <w:r>
+        <w:t xml:space="preserve"> </w:t>
+      </w:r>
+      <w:r>
+        <w:t>corresponding to the largest version number in t</w:t>
+      </w:r>
+      <w:r>
+        <w:t xml:space="preserve">he </w:t>
+      </w:r>
+      <w:r>
+        <w:rPr>
+          <w:rStyle w:val="SKeyword"/>
+        </w:rPr>
+        <w:t>Versions</w:t>
+      </w:r>
+      <w:r>
+        <w:t xml:space="preserve"> element</w:t>
+      </w:r>
+      <w:r>
+        <w:t>.</w:t>
+      </w:r>
+    </w:p>
+    <w:p>
+      <w:pPr>
+        <w:pStyle w:val="Heading2"/>
+      </w:pPr>
+      <w:proofErr w:type="spellStart"/>
+      <w:r>
+        <w:t>Get</w:t>
+      </w:r>
+      <w:r>
+        <w:t>Latest</w:t>
+      </w:r>
+      <w:r>
+        <w:t>Item</w:t>
+      </w:r>
       <w:proofErr w:type="spellEnd"/>
-      <w:r>
-        <w:t xml:space="preserve"> element shall corre</w:t>
-      </w:r>
-      <w:r>
-        <w:t xml:space="preserve">spond to </w:t>
-      </w:r>
-      <w:r>
-        <w:t xml:space="preserve">the latest published version of an </w:t>
+    </w:p>
+    <w:p>
+      <w:pPr>
+        <w:pStyle w:val="Heading3"/>
+      </w:pPr>
+      <w:r>
+        <w:t>General</w:t>
+      </w:r>
+    </w:p>
+    <w:p>
+      <w:pPr>
+        <w:pStyle w:val="BodyText"/>
+      </w:pPr>
+      <w:r>
+        <w:t xml:space="preserve">This </w:t>
+      </w:r>
+      <w:r>
+        <w:t xml:space="preserve">request </w:t>
+      </w:r>
+      <w:r>
+        <w:t xml:space="preserve">retrieves the latest </w:t>
+      </w:r>
+      <w:r>
+        <w:t>"published" or "withdrawn"</w:t>
+      </w:r>
+      <w:r>
+        <w:t xml:space="preserve"> </w:t>
+      </w:r>
+      <w:r>
+        <w:t>version</w:t>
+      </w:r>
+      <w:r>
+        <w:t xml:space="preserve"> </w:t>
+      </w:r>
+      <w:r>
+        <w:t>of an item from the catalog</w:t>
+      </w:r>
+      <w:r>
+        <w:t>ue</w:t>
+      </w:r>
+      <w:r>
+        <w:t>.</w:t>
+      </w:r>
+    </w:p>
+    <w:p>
+      <w:pPr>
+        <w:pStyle w:val="BodyText"/>
+      </w:pPr>
+      <w:r>
+        <w:t xml:space="preserve">This request should be used if the </w:t>
+      </w:r>
+      <w:r>
+        <w:rPr>
+          <w:rStyle w:val="SKeyword"/>
+        </w:rPr>
+        <w:t>EBUQCID</w:t>
+      </w:r>
+      <w:r>
+        <w:t xml:space="preserve"> of an item is known but its version is not.</w:t>
+      </w:r>
+    </w:p>
+    <w:p>
+      <w:pPr>
+        <w:pStyle w:val="BodyText"/>
+      </w:pPr>
+      <w:r>
+        <w:t xml:space="preserve">The </w:t>
+      </w:r>
+      <w:proofErr w:type="spellStart"/>
+      <w:r>
+        <w:t>GetItems</w:t>
+      </w:r>
+      <w:proofErr w:type="spellEnd"/>
+      <w:r>
+        <w:t xml:space="preserve"> request should be used instead if</w:t>
+      </w:r>
+      <w:r>
+        <w:t xml:space="preserve"> retrieving</w:t>
+      </w:r>
+      <w:r>
+        <w:t xml:space="preserve"> the latest version of significantly more than one item.</w:t>
+      </w:r>
+    </w:p>
+    <w:p>
+      <w:pPr>
+        <w:pStyle w:val="SNote"/>
+      </w:pPr>
+      <w:r>
+        <w:t xml:space="preserve">EXAMPLE: The following retrieves the item whose </w:t>
+      </w:r>
+      <w:r>
+        <w:rPr>
+          <w:rStyle w:val="SKeyword"/>
+        </w:rPr>
+        <w:t>EBUQCID</w:t>
+      </w:r>
+      <w:r>
+        <w:t xml:space="preserve"> is equal to </w:t>
+      </w:r>
+      <w:r>
+        <w:rPr>
+          <w:rStyle w:val="SKeyword"/>
+        </w:rPr>
+        <w:t>"0002B"</w:t>
+      </w:r>
+      <w:r>
+        <w:t>.</w:t>
+      </w:r>
+    </w:p>
+    <w:p>
+      <w:pPr>
+        <w:pStyle w:val="SCodeSchemaExample"/>
+      </w:pPr>
+      <w:r>
+        <w:t>GET https://localhost/qccatalog/v</w:t>
+      </w:r>
+      <w:r>
+        <w:t>3</w:t>
+      </w:r>
+      <w:r>
+        <w:t>/item</w:t>
+      </w:r>
+      <w:r>
+        <w:t>s</w:t>
+      </w:r>
+      <w:r>
+        <w:t>/</w:t>
+      </w:r>
+      <w:r>
+        <w:t>0002B</w:t>
+      </w:r>
+    </w:p>
+    <w:p>
+      <w:pPr>
+        <w:pStyle w:val="Heading3"/>
+      </w:pPr>
+      <w:r>
+        <w:t>Method</w:t>
+      </w:r>
+      <w:r>
+        <w:t xml:space="preserve"> and Target</w:t>
+      </w:r>
+    </w:p>
+    <w:p>
+      <w:pPr>
+        <w:pStyle w:val="SCodeSchemaExample"/>
+      </w:pPr>
+      <w:r>
+        <w:t>GET</w:t>
+      </w:r>
+      <w:r>
+        <w:t xml:space="preserve"> {</w:t>
+      </w:r>
+      <w:r>
+        <w:t>baseURI</w:t>
+      </w:r>
+      <w:r>
+        <w:t>}/items</w:t>
+      </w:r>
+      <w:r>
+        <w:t>/{id}</w:t>
+      </w:r>
+    </w:p>
+    <w:p>
+      <w:pPr>
+        <w:pStyle w:val="Heading3"/>
+      </w:pPr>
+      <w:r>
+        <w:t>Body</w:t>
+      </w:r>
+    </w:p>
+    <w:p>
+      <w:pPr>
+        <w:pStyle w:val="BodyText"/>
+      </w:pPr>
+      <w:proofErr w:type="gramStart"/>
+      <w:r>
+        <w:t>No body</w:t>
+      </w:r>
+      <w:proofErr w:type="gramEnd"/>
+      <w:r>
+        <w:t xml:space="preserve"> shall be present.</w:t>
+      </w:r>
+    </w:p>
+    <w:p>
+      <w:pPr>
+        <w:pStyle w:val="Heading3"/>
+        <w:rPr>
+          <w:lang w:val="en-US"/>
+        </w:rPr>
+      </w:pPr>
+      <w:r>
+        <w:t>Response</w:t>
+      </w:r>
+      <w:r>
+        <w:rPr>
+          <w:lang w:val="en-US"/>
+        </w:rPr>
+        <w:t>s</w:t>
+      </w:r>
+    </w:p>
+    <w:p>
+      <w:pPr>
+        <w:pStyle w:val="Heading4"/>
+        <w:spacing w:before="280"/>
+      </w:pPr>
+      <w:r>
+        <w:t>200 OK</w:t>
+      </w:r>
+    </w:p>
+    <w:p>
+      <w:pPr>
+        <w:pStyle w:val="BodyText"/>
+      </w:pPr>
+      <w:r>
+        <w:t xml:space="preserve">The response shall consist of a single XML Document with an instance of the </w:t>
+      </w:r>
+      <w:r>
+        <w:rPr>
+          <w:rStyle w:val="SKeyword"/>
+        </w:rPr>
+        <w:t>I</w:t>
+      </w:r>
+      <w:r>
+        <w:rPr>
+          <w:rStyle w:val="SKeyword"/>
+        </w:rPr>
+        <w:t>tem</w:t>
+      </w:r>
+      <w:r>
+        <w:rPr>
+          <w:rStyle w:val="SKeyword"/>
+        </w:rPr>
+        <w:t>Info</w:t>
+      </w:r>
+      <w:r>
+        <w:t xml:space="preserve"> element as its root</w:t>
+      </w:r>
+      <w:r>
+        <w:t>.</w:t>
+      </w:r>
+    </w:p>
+    <w:p>
+      <w:pPr>
+        <w:pStyle w:val="BodyText"/>
+        <w:keepNext/>
+        <w:keepLines/>
+      </w:pPr>
+      <w:r>
+        <w:lastRenderedPageBreak/>
+        <w:t>For this</w:t>
+      </w:r>
+      <w:r>
+        <w:t xml:space="preserve"> </w:t>
+      </w:r>
+      <w:r>
+        <w:rPr>
+          <w:rStyle w:val="SKeyword"/>
+        </w:rPr>
+        <w:t>ItemInfo</w:t>
+      </w:r>
+      <w:r>
+        <w:t xml:space="preserve"> element:</w:t>
+      </w:r>
+    </w:p>
+    <w:p>
+      <w:pPr>
+        <w:pStyle w:val="BodyText"/>
+        <w:keepNext/>
+        <w:keepLines/>
+        <w:numPr>
+          <w:ilvl w:val="0"/>
+          <w:numId w:val="28"/>
+        </w:numPr>
+      </w:pPr>
+      <w:r>
+        <w:t xml:space="preserve">The </w:t>
+      </w:r>
+      <w:r>
+        <w:rPr>
+          <w:rStyle w:val="SKeyword"/>
+        </w:rPr>
+        <w:t>ItemInfo</w:t>
+      </w:r>
+      <w:r>
+        <w:t xml:space="preserve"> element shall describe the </w:t>
       </w:r>
       <w:r>
         <w:t xml:space="preserve">item </w:t>
       </w:r>
       <w:r>
-        <w:t xml:space="preserve">in </w:t>
-      </w:r>
-      <w:r>
-        <w:t>the catalog</w:t>
-      </w:r>
-      <w:r>
-        <w:t>ue</w:t>
-      </w:r>
-      <w:r>
-        <w:t xml:space="preserve">, and </w:t>
-      </w:r>
-      <w:r>
-        <w:rPr>
-          <w:rStyle w:val="SKeyword"/>
-        </w:rPr>
-        <w:t>I</w:t>
-      </w:r>
-      <w:r>
-        <w:rPr>
-          <w:rStyle w:val="SKeyword"/>
-        </w:rPr>
-        <w:t>tems</w:t>
-      </w:r>
-      <w:r>
-        <w:t xml:space="preserve"> shall include all items of the catalog</w:t>
-      </w:r>
-      <w:r>
-        <w:t>ue</w:t>
+        <w:t xml:space="preserve">version </w:t>
+      </w:r>
+      <w:r>
+        <w:t>with</w:t>
+      </w:r>
+      <w:r>
+        <w:t xml:space="preserve"> </w:t>
+      </w:r>
+      <w:r>
+        <w:rPr>
+          <w:rStyle w:val="SKeyword"/>
+        </w:rPr>
+        <w:t>EBUQCID</w:t>
+      </w:r>
+      <w:r>
+        <w:t xml:space="preserve"> equal to </w:t>
+      </w:r>
+      <w:r>
+        <w:rPr>
+          <w:rStyle w:val="SKeyword"/>
+        </w:rPr>
+        <w:t>{id}</w:t>
+      </w:r>
+      <w:r>
+        <w:t xml:space="preserve"> and </w:t>
+      </w:r>
+      <w:proofErr w:type="spellStart"/>
+      <w:r>
+        <w:rPr>
+          <w:rStyle w:val="SKeyword"/>
+        </w:rPr>
+        <w:t>EBUQCVersion</w:t>
+      </w:r>
+      <w:proofErr w:type="spellEnd"/>
+      <w:r>
+        <w:t xml:space="preserve"> equal to </w:t>
+      </w:r>
+      <w:r>
+        <w:t>the largest version number in the</w:t>
+      </w:r>
+      <w:r>
+        <w:t xml:space="preserve"> </w:t>
+      </w:r>
+      <w:r>
+        <w:rPr>
+          <w:rStyle w:val="SKeyword"/>
+        </w:rPr>
+        <w:t>Versions</w:t>
+      </w:r>
+      <w:r>
+        <w:t xml:space="preserve"> element</w:t>
       </w:r>
       <w:r>
         <w:t>.</w:t>
@@ -2309,17 +3057,161 @@
     </w:p>
     <w:p>
       <w:pPr>
+        <w:pStyle w:val="BodyText"/>
+        <w:keepNext/>
+        <w:keepLines/>
+        <w:numPr>
+          <w:ilvl w:val="0"/>
+          <w:numId w:val="28"/>
+        </w:numPr>
+      </w:pPr>
+      <w:r>
+        <w:t xml:space="preserve">The </w:t>
+      </w:r>
+      <w:r>
+        <w:rPr>
+          <w:rStyle w:val="SKeyword"/>
+        </w:rPr>
+        <w:t>Versions</w:t>
+      </w:r>
+      <w:r>
+        <w:t xml:space="preserve"> element shall list the </w:t>
+      </w:r>
+      <w:proofErr w:type="spellStart"/>
+      <w:r>
+        <w:rPr>
+          <w:rStyle w:val="SKeyword"/>
+        </w:rPr>
+        <w:t>EBUQCVersion</w:t>
+      </w:r>
+      <w:proofErr w:type="spellEnd"/>
+      <w:r>
+        <w:t xml:space="preserve"> property of all versions of the item that have a </w:t>
+      </w:r>
+      <w:r>
+        <w:rPr>
+          <w:rStyle w:val="SKeyword"/>
+        </w:rPr>
+        <w:t>Status</w:t>
+      </w:r>
+      <w:r>
+        <w:t xml:space="preserve"> of either "published" or "withdrawn".</w:t>
+      </w:r>
+    </w:p>
+    <w:p>
+      <w:pPr>
+        <w:pStyle w:val="Heading4"/>
+        <w:spacing w:before="280"/>
+        <w:rPr>
+          <w:lang w:val="en-US"/>
+        </w:rPr>
+      </w:pPr>
+      <w:r>
+        <w:rPr>
+          <w:lang w:val="en-US"/>
+        </w:rPr>
+        <w:t>404</w:t>
+      </w:r>
+      <w:r>
+        <w:t xml:space="preserve"> </w:t>
+      </w:r>
+      <w:r>
+        <w:rPr>
+          <w:lang w:val="en-US"/>
+        </w:rPr>
+        <w:t>Not Found</w:t>
+      </w:r>
+    </w:p>
+    <w:p>
+      <w:pPr>
+        <w:pStyle w:val="BodyText"/>
+      </w:pPr>
+      <w:r>
+        <w:t xml:space="preserve">This response shall be returned if </w:t>
+      </w:r>
+      <w:r>
+        <w:t>the item identified b</w:t>
+      </w:r>
+      <w:r>
+        <w:t xml:space="preserve">y </w:t>
+      </w:r>
+      <w:r>
+        <w:rPr>
+          <w:rStyle w:val="SKeyword"/>
+        </w:rPr>
+        <w:t>EBUQCID</w:t>
+      </w:r>
+      <w:r>
+        <w:t xml:space="preserve"> equal to </w:t>
+      </w:r>
+      <w:r>
+        <w:rPr>
+          <w:rStyle w:val="SKeyword"/>
+        </w:rPr>
+        <w:t>{id}</w:t>
+      </w:r>
+      <w:r>
+        <w:t xml:space="preserve"> </w:t>
+      </w:r>
+      <w:r>
+        <w:t>either:</w:t>
+      </w:r>
+    </w:p>
+    <w:p>
+      <w:pPr>
+        <w:pStyle w:val="BodyText"/>
+        <w:numPr>
+          <w:ilvl w:val="0"/>
+          <w:numId w:val="28"/>
+        </w:numPr>
+      </w:pPr>
+      <w:r>
+        <w:t>does not exist;</w:t>
+      </w:r>
+    </w:p>
+    <w:p>
+      <w:pPr>
+        <w:pStyle w:val="BodyText"/>
+        <w:numPr>
+          <w:ilvl w:val="0"/>
+          <w:numId w:val="28"/>
+        </w:numPr>
+        <w:rPr>
+          <w:lang w:eastAsia="x-none"/>
+        </w:rPr>
+      </w:pPr>
+      <w:r>
+        <w:t xml:space="preserve">or </w:t>
+      </w:r>
+      <w:r>
+        <w:t xml:space="preserve">does not have at least one version with </w:t>
+      </w:r>
+      <w:r>
+        <w:t xml:space="preserve">a </w:t>
+      </w:r>
+      <w:r>
+        <w:rPr>
+          <w:rStyle w:val="SKeyword"/>
+        </w:rPr>
+        <w:t>Status</w:t>
+      </w:r>
+      <w:r>
+        <w:t xml:space="preserve"> </w:t>
+      </w:r>
+      <w:r>
+        <w:t xml:space="preserve">of </w:t>
+      </w:r>
+      <w:r>
+        <w:t>"published"</w:t>
+      </w:r>
+    </w:p>
+    <w:p>
+      <w:pPr>
         <w:pStyle w:val="Heading2"/>
       </w:pPr>
       <w:proofErr w:type="spellStart"/>
       <w:r>
-        <w:t>Get</w:t>
-      </w:r>
-      <w:r>
-        <w:t>Latest</w:t>
-      </w:r>
-      <w:r>
-        <w:t>Item</w:t>
+        <w:t>GetItemVersion</w:t>
       </w:r>
       <w:proofErr w:type="spellEnd"/>
     </w:p>
@@ -2328,7 +3220,7 @@
         <w:pStyle w:val="Heading3"/>
       </w:pPr>
       <w:r>
-        <w:t>General</w:t>
+        <w:t>Description</w:t>
       </w:r>
     </w:p>
     <w:p>
@@ -2342,13 +3234,242 @@
         <w:t xml:space="preserve">request </w:t>
       </w:r>
       <w:r>
-        <w:t xml:space="preserve">retrieves the latest published </w:t>
-      </w:r>
-      <w:r>
-        <w:t>version of an item from the catalog</w:t>
-      </w:r>
-      <w:r>
-        <w:t>ue</w:t>
+        <w:t xml:space="preserve">retrieves a specific </w:t>
+      </w:r>
+      <w:r>
+        <w:t>"published" or "withdrawn" version of an item from the catalogue.</w:t>
+      </w:r>
+    </w:p>
+    <w:p>
+      <w:pPr>
+        <w:pStyle w:val="BodyText"/>
+      </w:pPr>
+      <w:r>
+        <w:t xml:space="preserve">Since an item with a given combination of </w:t>
+      </w:r>
+      <w:proofErr w:type="spellStart"/>
+      <w:r>
+        <w:rPr>
+          <w:rStyle w:val="SKeyword"/>
+        </w:rPr>
+        <w:t>EBUQCVersion</w:t>
+      </w:r>
+      <w:proofErr w:type="spellEnd"/>
+      <w:r>
+        <w:t xml:space="preserve"> and </w:t>
+      </w:r>
+      <w:r>
+        <w:rPr>
+          <w:rStyle w:val="SKeyword"/>
+        </w:rPr>
+        <w:t>EBUQCID</w:t>
+      </w:r>
+      <w:r>
+        <w:t xml:space="preserve"> is immutable, the caller should cache the results of </w:t>
+      </w:r>
+      <w:r>
+        <w:t>a</w:t>
+      </w:r>
+      <w:r>
+        <w:t xml:space="preserve"> request for a specific version of the item, and no further request</w:t>
+      </w:r>
+      <w:r>
+        <w:t xml:space="preserve"> for the same specific version of the item</w:t>
+      </w:r>
+      <w:r>
+        <w:t xml:space="preserve"> </w:t>
+      </w:r>
+      <w:r>
+        <w:t>should be made.</w:t>
+      </w:r>
+    </w:p>
+    <w:p>
+      <w:pPr>
+        <w:pStyle w:val="Heading3"/>
+      </w:pPr>
+      <w:r>
+        <w:t>Method and Target</w:t>
+      </w:r>
+    </w:p>
+    <w:p>
+      <w:pPr>
+        <w:pStyle w:val="SCodeSchemaExample"/>
+      </w:pPr>
+      <w:r>
+        <w:t>GET {</w:t>
+      </w:r>
+      <w:r>
+        <w:t>baseURI</w:t>
+      </w:r>
+      <w:r>
+        <w:t>}/items/{id}</w:t>
+      </w:r>
+      <w:r>
+        <w:t>/</w:t>
+      </w:r>
+      <w:r>
+        <w:t>versions/</w:t>
+      </w:r>
+      <w:r>
+        <w:t>{version}</w:t>
+      </w:r>
+    </w:p>
+    <w:p>
+      <w:pPr>
+        <w:pStyle w:val="Heading3"/>
+      </w:pPr>
+      <w:r>
+        <w:t>Body</w:t>
+      </w:r>
+    </w:p>
+    <w:p>
+      <w:pPr>
+        <w:pStyle w:val="BodyText"/>
+      </w:pPr>
+      <w:proofErr w:type="gramStart"/>
+      <w:r>
+        <w:t>No body</w:t>
+      </w:r>
+      <w:proofErr w:type="gramEnd"/>
+      <w:r>
+        <w:t xml:space="preserve"> shall be present.</w:t>
+      </w:r>
+    </w:p>
+    <w:p>
+      <w:pPr>
+        <w:pStyle w:val="Heading3"/>
+        <w:rPr>
+          <w:lang w:val="en-US"/>
+        </w:rPr>
+      </w:pPr>
+      <w:r>
+        <w:t>Response</w:t>
+      </w:r>
+      <w:r>
+        <w:rPr>
+          <w:lang w:val="en-US"/>
+        </w:rPr>
+        <w:t>s</w:t>
+      </w:r>
+    </w:p>
+    <w:p>
+      <w:pPr>
+        <w:pStyle w:val="Heading4"/>
+        <w:spacing w:before="280"/>
+      </w:pPr>
+      <w:r>
+        <w:t>200 OK</w:t>
+      </w:r>
+    </w:p>
+    <w:p>
+      <w:pPr>
+        <w:pStyle w:val="BodyText"/>
+      </w:pPr>
+      <w:r>
+        <w:t xml:space="preserve">The response shall consist of a single XML Document with an instance of the </w:t>
+      </w:r>
+      <w:r>
+        <w:rPr>
+          <w:rStyle w:val="SKeyword"/>
+        </w:rPr>
+        <w:t>ItemInfo</w:t>
+      </w:r>
+      <w:r>
+        <w:t xml:space="preserve"> element as its root.</w:t>
+      </w:r>
+    </w:p>
+    <w:p>
+      <w:pPr>
+        <w:pStyle w:val="BodyText"/>
+      </w:pPr>
+      <w:r>
+        <w:t>For this</w:t>
+      </w:r>
+      <w:r>
+        <w:t xml:space="preserve"> </w:t>
+      </w:r>
+      <w:r>
+        <w:rPr>
+          <w:rStyle w:val="SKeyword"/>
+        </w:rPr>
+        <w:t>ItemInfo</w:t>
+      </w:r>
+      <w:r>
+        <w:t xml:space="preserve"> element:</w:t>
+      </w:r>
+    </w:p>
+    <w:p>
+      <w:pPr>
+        <w:pStyle w:val="BodyText"/>
+        <w:numPr>
+          <w:ilvl w:val="0"/>
+          <w:numId w:val="28"/>
+        </w:numPr>
+      </w:pPr>
+      <w:r>
+        <w:t xml:space="preserve">The </w:t>
+      </w:r>
+      <w:r>
+        <w:rPr>
+          <w:rStyle w:val="SKeyword"/>
+        </w:rPr>
+        <w:t>ItemInfo</w:t>
+      </w:r>
+      <w:r>
+        <w:t xml:space="preserve"> element shall describe the </w:t>
+      </w:r>
+      <w:r>
+        <w:t xml:space="preserve">item </w:t>
+      </w:r>
+      <w:r>
+        <w:t>with</w:t>
+      </w:r>
+      <w:r>
+        <w:t xml:space="preserve"> </w:t>
+      </w:r>
+      <w:r>
+        <w:rPr>
+          <w:rStyle w:val="SKeyword"/>
+        </w:rPr>
+        <w:t>EBUQCID</w:t>
+      </w:r>
+      <w:r>
+        <w:t xml:space="preserve"> equal to </w:t>
+      </w:r>
+      <w:r>
+        <w:rPr>
+          <w:rStyle w:val="SKeyword"/>
+        </w:rPr>
+        <w:t>{id}</w:t>
+      </w:r>
+      <w:r>
+        <w:t xml:space="preserve"> </w:t>
+      </w:r>
+      <w:r>
+        <w:t xml:space="preserve">and </w:t>
+      </w:r>
+      <w:proofErr w:type="spellStart"/>
+      <w:r>
+        <w:rPr>
+          <w:rStyle w:val="SKeyword"/>
+        </w:rPr>
+        <w:t>EBUQCVersion</w:t>
+      </w:r>
+      <w:proofErr w:type="spellEnd"/>
+      <w:r>
+        <w:t xml:space="preserve"> </w:t>
+      </w:r>
+      <w:r>
+        <w:t xml:space="preserve">equal </w:t>
+      </w:r>
+      <w:r>
+        <w:t xml:space="preserve">to </w:t>
+      </w:r>
+      <w:r>
+        <w:rPr>
+          <w:rStyle w:val="SKeyword"/>
+        </w:rPr>
+        <w:t>{version}</w:t>
       </w:r>
       <w:r>
         <w:t>.</w:t>
@@ -2357,148 +3478,43 @@
     <w:p>
       <w:pPr>
         <w:pStyle w:val="BodyText"/>
-      </w:pPr>
-      <w:r>
-        <w:t xml:space="preserve">This request should be used if the </w:t>
-      </w:r>
-      <w:r>
-        <w:rPr>
-          <w:rStyle w:val="SKeyword"/>
-        </w:rPr>
-        <w:t>EBUQCID</w:t>
-      </w:r>
-      <w:r>
-        <w:t xml:space="preserve"> of an item is known but its version is not.</w:t>
-      </w:r>
-    </w:p>
-    <w:p>
-      <w:pPr>
-        <w:pStyle w:val="BodyText"/>
+        <w:numPr>
+          <w:ilvl w:val="0"/>
+          <w:numId w:val="28"/>
+        </w:numPr>
       </w:pPr>
       <w:r>
         <w:lastRenderedPageBreak/>
         <w:t xml:space="preserve">The </w:t>
       </w:r>
+      <w:r>
+        <w:rPr>
+          <w:rStyle w:val="SKeyword"/>
+        </w:rPr>
+        <w:t>Versions</w:t>
+      </w:r>
+      <w:r>
+        <w:t xml:space="preserve"> element shall list the </w:t>
+      </w:r>
       <w:proofErr w:type="spellStart"/>
       <w:r>
-        <w:t>GetItems</w:t>
+        <w:rPr>
+          <w:rStyle w:val="SKeyword"/>
+        </w:rPr>
+        <w:t>EBUQCVersion</w:t>
       </w:r>
       <w:proofErr w:type="spellEnd"/>
       <w:r>
-        <w:t xml:space="preserve"> request should be used instead if</w:t>
-      </w:r>
-      <w:r>
-        <w:t xml:space="preserve"> retrieving</w:t>
-      </w:r>
-      <w:r>
-        <w:t xml:space="preserve"> the latest version of significantly more than one item is needed.</w:t>
-      </w:r>
-    </w:p>
-    <w:p>
-      <w:pPr>
-        <w:pStyle w:val="SNote"/>
-      </w:pPr>
-      <w:r>
-        <w:t xml:space="preserve">EXAMPLE: The following retrieves the item whose </w:t>
-      </w:r>
-      <w:r>
-        <w:rPr>
-          <w:rStyle w:val="SKeyword"/>
-        </w:rPr>
-        <w:t>EBUQCID</w:t>
-      </w:r>
-      <w:r>
-        <w:t xml:space="preserve"> is equal to </w:t>
-      </w:r>
-      <w:r>
-        <w:rPr>
-          <w:rStyle w:val="SKeyword"/>
-        </w:rPr>
-        <w:t>"0002B"</w:t>
-      </w:r>
-      <w:r>
-        <w:t>.</w:t>
-      </w:r>
-    </w:p>
-    <w:p>
-      <w:pPr>
-        <w:pStyle w:val="SCodeSchemaExample"/>
-      </w:pPr>
-      <w:r>
-        <w:t>GET https://localhost/qccatalog/v</w:t>
-      </w:r>
-      <w:r>
-        <w:t>2</w:t>
-      </w:r>
-      <w:r>
-        <w:t>/item</w:t>
-      </w:r>
-      <w:r>
-        <w:t>s</w:t>
-      </w:r>
-      <w:r>
-        <w:t>/</w:t>
-      </w:r>
-      <w:r>
-        <w:t>0002B</w:t>
-      </w:r>
-    </w:p>
-    <w:p>
-      <w:pPr>
-        <w:pStyle w:val="Heading3"/>
-      </w:pPr>
-      <w:r>
-        <w:t>Method</w:t>
-      </w:r>
-      <w:r>
-        <w:t xml:space="preserve"> and Target</w:t>
-      </w:r>
-    </w:p>
-    <w:p>
-      <w:pPr>
-        <w:pStyle w:val="SCodeSchemaExample"/>
-      </w:pPr>
-      <w:r>
-        <w:t>GET</w:t>
-      </w:r>
-      <w:r>
-        <w:t xml:space="preserve"> {uri-base}/items</w:t>
-      </w:r>
-      <w:r>
-        <w:t>/{id}</w:t>
-      </w:r>
-    </w:p>
-    <w:p>
-      <w:pPr>
-        <w:pStyle w:val="Heading3"/>
-      </w:pPr>
-      <w:r>
-        <w:t>Body</w:t>
-      </w:r>
-    </w:p>
-    <w:p>
-      <w:pPr>
-        <w:pStyle w:val="BodyText"/>
-      </w:pPr>
-      <w:r>
-        <w:t>No body shall be present.</w:t>
-      </w:r>
-    </w:p>
-    <w:p>
-      <w:pPr>
-        <w:pStyle w:val="Heading3"/>
-        <w:rPr>
-          <w:lang w:val="en-US"/>
-        </w:rPr>
-      </w:pPr>
-      <w:r>
-        <w:t>Response</w:t>
-      </w:r>
-      <w:r>
-        <w:rPr>
-          <w:lang w:val="en-US"/>
-        </w:rPr>
-        <w:t>s</w:t>
+        <w:t xml:space="preserve"> property of all versions of the item that have a </w:t>
+      </w:r>
+      <w:r>
+        <w:rPr>
+          <w:rStyle w:val="SKeyword"/>
+        </w:rPr>
+        <w:t>Status</w:t>
+      </w:r>
+      <w:r>
+        <w:t xml:space="preserve"> of either "published" or "withdrawn".</w:t>
       </w:r>
     </w:p>
     <w:p>
@@ -2507,7 +3523,19 @@
         <w:spacing w:before="280"/>
       </w:pPr>
       <w:r>
-        <w:t>200 OK</w:t>
+        <w:rPr>
+          <w:lang w:val="en-US"/>
+        </w:rPr>
+        <w:t>404</w:t>
+      </w:r>
+      <w:r>
+        <w:t xml:space="preserve"> </w:t>
+      </w:r>
+      <w:r>
+        <w:rPr>
+          <w:lang w:val="en-US"/>
+        </w:rPr>
+        <w:t>Not Found</w:t>
       </w:r>
     </w:p>
     <w:p>
@@ -2515,482 +3543,110 @@
         <w:pStyle w:val="BodyText"/>
       </w:pPr>
       <w:r>
-        <w:t xml:space="preserve">The response shall consist of a single XML Document with an instance of the </w:t>
+        <w:t xml:space="preserve">This response shall be returned if </w:t>
+      </w:r>
+      <w:r>
+        <w:t xml:space="preserve">the </w:t>
+      </w:r>
+      <w:r>
+        <w:t>item</w:t>
+      </w:r>
+      <w:r>
+        <w:t xml:space="preserve"> version</w:t>
+      </w:r>
+      <w:r>
+        <w:t xml:space="preserve"> identified b</w:t>
+      </w:r>
+      <w:r>
+        <w:t xml:space="preserve">y </w:t>
+      </w:r>
+      <w:r>
+        <w:rPr>
+          <w:rStyle w:val="SKeyword"/>
+        </w:rPr>
+        <w:t>EBUQCID</w:t>
+      </w:r>
+      <w:r>
+        <w:t xml:space="preserve"> equal to </w:t>
+      </w:r>
+      <w:r>
+        <w:rPr>
+          <w:rStyle w:val="SKeyword"/>
+        </w:rPr>
+        <w:t>{id}</w:t>
+      </w:r>
+      <w:r>
+        <w:t xml:space="preserve"> </w:t>
+      </w:r>
+      <w:r>
+        <w:t xml:space="preserve">and </w:t>
       </w:r>
       <w:proofErr w:type="spellStart"/>
       <w:r>
         <w:rPr>
           <w:rStyle w:val="SKeyword"/>
         </w:rPr>
-        <w:t>I</w:t>
-      </w:r>
-      <w:r>
-        <w:rPr>
-          <w:rStyle w:val="SKeyword"/>
-        </w:rPr>
-        <w:t>tem</w:t>
-      </w:r>
-      <w:r>
-        <w:rPr>
-          <w:rStyle w:val="SKeyword"/>
-        </w:rPr>
-        <w:t>Info</w:t>
+        <w:t>EBUQCVersion</w:t>
       </w:r>
       <w:proofErr w:type="spellEnd"/>
       <w:r>
-        <w:t xml:space="preserve"> element as its root</w:t>
-      </w:r>
-      <w:r>
-        <w:t>.</w:t>
+        <w:t xml:space="preserve"> </w:t>
+      </w:r>
+      <w:r>
+        <w:t xml:space="preserve">equal </w:t>
+      </w:r>
+      <w:r>
+        <w:t xml:space="preserve">to </w:t>
+      </w:r>
+      <w:r>
+        <w:rPr>
+          <w:rStyle w:val="SKeyword"/>
+        </w:rPr>
+        <w:t>{version}</w:t>
+      </w:r>
+      <w:r>
+        <w:t xml:space="preserve"> either</w:t>
+      </w:r>
+      <w:r>
+        <w:t>:</w:t>
       </w:r>
     </w:p>
     <w:p>
       <w:pPr>
         <w:pStyle w:val="BodyText"/>
-      </w:pPr>
-      <w:r>
-        <w:t xml:space="preserve">The </w:t>
-      </w:r>
-      <w:proofErr w:type="spellStart"/>
-      <w:r>
-        <w:rPr>
-          <w:rStyle w:val="SKeyword"/>
-        </w:rPr>
-        <w:t>ItemInfo</w:t>
-      </w:r>
-      <w:proofErr w:type="spellEnd"/>
-      <w:r>
-        <w:t xml:space="preserve"> element shall </w:t>
-      </w:r>
-      <w:r>
-        <w:t>correspond</w:t>
-      </w:r>
-      <w:r>
-        <w:t xml:space="preserve"> to</w:t>
-      </w:r>
-      <w:r>
-        <w:t xml:space="preserve"> the </w:t>
-      </w:r>
-      <w:r>
-        <w:t xml:space="preserve">highest </w:t>
-      </w:r>
-      <w:r>
-        <w:t xml:space="preserve">published </w:t>
-      </w:r>
-      <w:r>
-        <w:t xml:space="preserve">version of </w:t>
-      </w:r>
-      <w:r>
-        <w:t xml:space="preserve">the </w:t>
-      </w:r>
-      <w:r>
-        <w:t xml:space="preserve">item whose </w:t>
-      </w:r>
-      <w:r>
-        <w:rPr>
-          <w:rStyle w:val="SKeyword"/>
-        </w:rPr>
-        <w:t>EBUQCID</w:t>
-      </w:r>
-      <w:r>
-        <w:t xml:space="preserve"> is equal to </w:t>
-      </w:r>
-      <w:r>
-        <w:rPr>
-          <w:rStyle w:val="SKeyword"/>
-        </w:rPr>
-        <w:t>{id</w:t>
-      </w:r>
-      <w:r>
-        <w:rPr>
-          <w:rStyle w:val="SKeyword"/>
-        </w:rPr>
-        <w:t>}</w:t>
-      </w:r>
-      <w:r>
-        <w:t>.</w:t>
-      </w:r>
-    </w:p>
-    <w:p>
-      <w:pPr>
-        <w:pStyle w:val="Heading4"/>
-        <w:spacing w:before="280"/>
-      </w:pPr>
-      <w:r>
-        <w:rPr>
-          <w:lang w:val="en-US"/>
-        </w:rPr>
-        <w:t>404</w:t>
-      </w:r>
-      <w:r>
-        <w:t xml:space="preserve"> </w:t>
-      </w:r>
-      <w:r>
-        <w:rPr>
-          <w:lang w:val="en-US"/>
-        </w:rPr>
-        <w:t>Not Found</w:t>
+        <w:numPr>
+          <w:ilvl w:val="0"/>
+          <w:numId w:val="28"/>
+        </w:numPr>
+      </w:pPr>
+      <w:r>
+        <w:t>does not exist</w:t>
+      </w:r>
+      <w:r>
+        <w:t>;</w:t>
       </w:r>
     </w:p>
     <w:p>
       <w:pPr>
         <w:pStyle w:val="BodyText"/>
-      </w:pPr>
-      <w:r>
-        <w:t xml:space="preserve">This response shall be returned if there is no published item whose </w:t>
-      </w:r>
-      <w:r>
-        <w:rPr>
-          <w:rStyle w:val="SKeyword"/>
-        </w:rPr>
-        <w:t>EBUQCID</w:t>
-      </w:r>
-      <w:r>
-        <w:t xml:space="preserve"> is equal to </w:t>
-      </w:r>
-      <w:r>
-        <w:rPr>
-          <w:rStyle w:val="SKeyword"/>
-        </w:rPr>
-        <w:t>{id}</w:t>
-      </w:r>
-      <w:r>
-        <w:rPr>
-          <w:rStyle w:val="SKeyword"/>
-        </w:rPr>
-        <w:t>.</w:t>
-      </w:r>
-    </w:p>
-    <w:p>
-      <w:pPr>
-        <w:pStyle w:val="Heading2"/>
-      </w:pPr>
-      <w:proofErr w:type="spellStart"/>
-      <w:r>
-        <w:t>GetItemVersion</w:t>
-      </w:r>
-      <w:proofErr w:type="spellEnd"/>
-    </w:p>
-    <w:p>
-      <w:pPr>
-        <w:pStyle w:val="Heading3"/>
-      </w:pPr>
-      <w:r>
-        <w:t>Description</w:t>
-      </w:r>
-    </w:p>
-    <w:p>
-      <w:pPr>
-        <w:pStyle w:val="BodyText"/>
-      </w:pPr>
-      <w:r>
-        <w:t xml:space="preserve">This </w:t>
-      </w:r>
-      <w:r>
-        <w:t xml:space="preserve">request </w:t>
-      </w:r>
-      <w:r>
-        <w:t xml:space="preserve">retrieves a specific </w:t>
-      </w:r>
-      <w:r>
-        <w:t>version of an item from the catalog</w:t>
-      </w:r>
-      <w:r>
-        <w:t>ue</w:t>
-      </w:r>
-      <w:r>
-        <w:t>.</w:t>
-      </w:r>
-    </w:p>
-    <w:p>
-      <w:pPr>
-        <w:pStyle w:val="BodyText"/>
-      </w:pPr>
-      <w:r>
-        <w:t xml:space="preserve">Since an item with a given combination of </w:t>
-      </w:r>
-      <w:proofErr w:type="spellStart"/>
-      <w:r>
-        <w:rPr>
-          <w:rStyle w:val="SKeyword"/>
-        </w:rPr>
-        <w:t>EBUQCVersion</w:t>
-      </w:r>
-      <w:proofErr w:type="spellEnd"/>
-      <w:r>
-        <w:t xml:space="preserve"> and </w:t>
-      </w:r>
-      <w:r>
-        <w:rPr>
-          <w:rStyle w:val="SKeyword"/>
-        </w:rPr>
-        <w:t>EBUQCID</w:t>
-      </w:r>
-      <w:r>
-        <w:t xml:space="preserve"> is immutable, the caller should cache the results of </w:t>
-      </w:r>
-      <w:r>
-        <w:t>a</w:t>
-      </w:r>
-      <w:r>
-        <w:t xml:space="preserve"> request for a specific version of the item, and no further request</w:t>
-      </w:r>
-      <w:r>
-        <w:t xml:space="preserve"> for the same specific version of the item</w:t>
-      </w:r>
-      <w:r>
-        <w:t xml:space="preserve"> </w:t>
-      </w:r>
-      <w:r>
-        <w:t>should be made.</w:t>
-      </w:r>
-    </w:p>
-    <w:p>
-      <w:pPr>
-        <w:pStyle w:val="Heading3"/>
-      </w:pPr>
-      <w:r>
-        <w:t>Method and Target</w:t>
-      </w:r>
-    </w:p>
-    <w:p>
-      <w:pPr>
-        <w:pStyle w:val="SCodeSchemaExample"/>
-      </w:pPr>
-      <w:r>
-        <w:t>GET</w:t>
-      </w:r>
-      <w:r>
-        <w:t xml:space="preserve"> {uri-base}/items/{id}</w:t>
-      </w:r>
-      <w:r>
-        <w:t>/</w:t>
-      </w:r>
-      <w:r>
-        <w:t>versions/</w:t>
-      </w:r>
-      <w:r>
-        <w:t>{version}</w:t>
-      </w:r>
-    </w:p>
-    <w:p>
-      <w:pPr>
-        <w:pStyle w:val="Heading3"/>
-      </w:pPr>
-      <w:r>
-        <w:t>Body</w:t>
-      </w:r>
-    </w:p>
-    <w:p>
-      <w:pPr>
-        <w:pStyle w:val="BodyText"/>
-      </w:pPr>
-      <w:r>
-        <w:t>No body shall be present.</w:t>
-      </w:r>
-    </w:p>
-    <w:p>
-      <w:pPr>
-        <w:pStyle w:val="Heading3"/>
-        <w:rPr>
-          <w:lang w:val="en-US"/>
-        </w:rPr>
-      </w:pPr>
-      <w:r>
-        <w:lastRenderedPageBreak/>
-        <w:t>Response</w:t>
-      </w:r>
-      <w:r>
-        <w:rPr>
-          <w:lang w:val="en-US"/>
-        </w:rPr>
-        <w:t>s</w:t>
-      </w:r>
-    </w:p>
-    <w:p>
-      <w:pPr>
-        <w:pStyle w:val="Heading4"/>
-        <w:spacing w:before="280"/>
-      </w:pPr>
-      <w:r>
-        <w:t>200 OK</w:t>
-      </w:r>
-    </w:p>
-    <w:p>
-      <w:pPr>
-        <w:pStyle w:val="BodyText"/>
-      </w:pPr>
-      <w:r>
-        <w:t xml:space="preserve">The response shall consist of a single XML Document with an instance of the </w:t>
-      </w:r>
-      <w:proofErr w:type="spellStart"/>
-      <w:r>
-        <w:rPr>
-          <w:rStyle w:val="SKeyword"/>
-        </w:rPr>
-        <w:t>ItemInfo</w:t>
-      </w:r>
-      <w:proofErr w:type="spellEnd"/>
-      <w:r>
-        <w:t xml:space="preserve"> </w:t>
-      </w:r>
-      <w:r>
-        <w:t>element as its root</w:t>
-      </w:r>
-    </w:p>
-    <w:p>
-      <w:pPr>
-        <w:pStyle w:val="BodyText"/>
-      </w:pPr>
-      <w:r>
-        <w:t xml:space="preserve">The </w:t>
-      </w:r>
-      <w:proofErr w:type="spellStart"/>
-      <w:r>
-        <w:rPr>
-          <w:rStyle w:val="SKeyword"/>
-        </w:rPr>
-        <w:t>ItemInfo</w:t>
-      </w:r>
-      <w:proofErr w:type="spellEnd"/>
-      <w:r>
-        <w:t xml:space="preserve"> element shall </w:t>
-      </w:r>
-      <w:r>
-        <w:t xml:space="preserve">correspond to the published item </w:t>
-      </w:r>
-      <w:r>
-        <w:t xml:space="preserve">whose </w:t>
-      </w:r>
-      <w:proofErr w:type="spellStart"/>
-      <w:r>
-        <w:rPr>
-          <w:rStyle w:val="SKeyword"/>
-        </w:rPr>
-        <w:t>EBUQCVersion</w:t>
-      </w:r>
-      <w:proofErr w:type="spellEnd"/>
-      <w:r>
-        <w:t xml:space="preserve"> correspond</w:t>
-      </w:r>
-      <w:r>
-        <w:t>s</w:t>
-      </w:r>
-      <w:r>
-        <w:t xml:space="preserve"> to</w:t>
-      </w:r>
-      <w:r>
-        <w:t xml:space="preserve"> </w:t>
-      </w:r>
-      <w:r>
-        <w:rPr>
-          <w:rStyle w:val="SKeyword"/>
-        </w:rPr>
-        <w:t>{version}</w:t>
-      </w:r>
-      <w:r>
-        <w:t xml:space="preserve"> </w:t>
-      </w:r>
-      <w:r>
-        <w:t xml:space="preserve">and </w:t>
-      </w:r>
-      <w:r>
-        <w:t xml:space="preserve">whose </w:t>
-      </w:r>
-      <w:r>
-        <w:rPr>
-          <w:rStyle w:val="SKeyword"/>
-        </w:rPr>
-        <w:t>EBUQCID</w:t>
-      </w:r>
-      <w:r>
-        <w:t xml:space="preserve"> is equal to </w:t>
-      </w:r>
-      <w:r>
-        <w:rPr>
-          <w:rStyle w:val="SKeyword"/>
-        </w:rPr>
-        <w:t>{id}</w:t>
-      </w:r>
-      <w:r>
-        <w:t>.</w:t>
-      </w:r>
-    </w:p>
-    <w:p>
-      <w:pPr>
-        <w:pStyle w:val="Heading4"/>
-        <w:spacing w:before="280"/>
-      </w:pPr>
-      <w:r>
-        <w:rPr>
-          <w:lang w:val="en-US"/>
-        </w:rPr>
-        <w:t>404</w:t>
-      </w:r>
-      <w:r>
-        <w:t xml:space="preserve"> </w:t>
-      </w:r>
-      <w:r>
-        <w:rPr>
-          <w:lang w:val="en-US"/>
-        </w:rPr>
-        <w:t>Not Found</w:t>
-      </w:r>
-    </w:p>
-    <w:p>
-      <w:pPr>
-        <w:pStyle w:val="BodyText"/>
-        <w:rPr>
-          <w:rStyle w:val="SKeyword"/>
-        </w:rPr>
-      </w:pPr>
-      <w:r>
-        <w:t xml:space="preserve">This response shall be returned if there is no published item whose </w:t>
-      </w:r>
-      <w:proofErr w:type="spellStart"/>
-      <w:r>
-        <w:rPr>
-          <w:rStyle w:val="SKeyword"/>
-        </w:rPr>
-        <w:t>EBUQCVersion</w:t>
-      </w:r>
-      <w:proofErr w:type="spellEnd"/>
-      <w:r>
-        <w:t xml:space="preserve"> corresponds to </w:t>
-      </w:r>
-      <w:r>
-        <w:rPr>
-          <w:rStyle w:val="SKeyword"/>
-        </w:rPr>
-        <w:t>{version}</w:t>
-      </w:r>
-      <w:r>
-        <w:t xml:space="preserve"> and whose </w:t>
-      </w:r>
-      <w:r>
-        <w:rPr>
-          <w:rStyle w:val="SKeyword"/>
-        </w:rPr>
-        <w:t>EBUQCID</w:t>
-      </w:r>
-      <w:r>
-        <w:t xml:space="preserve"> is equal to </w:t>
-      </w:r>
-      <w:r>
-        <w:rPr>
-          <w:rStyle w:val="SKeyword"/>
-        </w:rPr>
-        <w:t>{id}</w:t>
-      </w:r>
-      <w:r>
-        <w:rPr>
-          <w:rStyle w:val="SKeyword"/>
-        </w:rPr>
-        <w:t>.</w:t>
-      </w:r>
-      <w:bookmarkStart w:id="3" w:name="_Ref483548286"/>
-    </w:p>
-    <w:bookmarkEnd w:id="3"/>
+        <w:numPr>
+          <w:ilvl w:val="0"/>
+          <w:numId w:val="28"/>
+        </w:numPr>
+      </w:pPr>
+      <w:r>
+        <w:t xml:space="preserve">or has a </w:t>
+      </w:r>
+      <w:r>
+        <w:rPr>
+          <w:rStyle w:val="SKeyword"/>
+        </w:rPr>
+        <w:t>Status</w:t>
+      </w:r>
+      <w:r>
+        <w:t xml:space="preserve"> other than "published" or "withdrawn"</w:t>
+      </w:r>
+    </w:p>
     <w:p>
       <w:pPr>
         <w:pStyle w:val="SBodyTextBullet"/>
@@ -3064,7 +3720,19 @@
       <w:rPr>
         <w:lang w:val="en-US"/>
       </w:rPr>
-      <w:t xml:space="preserve"> = "v2"</w:t>
+      <w:t xml:space="preserve"> = "v</w:t>
+    </w:r>
+    <w:r>
+      <w:rPr>
+        <w:lang w:val="en-US"/>
+      </w:rPr>
+      <w:t>3</w:t>
+    </w:r>
+    <w:r>
+      <w:rPr>
+        <w:lang w:val="en-US"/>
+      </w:rPr>
+      <w:t>"</w:t>
     </w:r>
     <w:r>
       <w:rPr>
@@ -3704,6 +4372,118 @@
     </w:lvl>
   </w:abstractNum>
   <w:abstractNum w:abstractNumId="13" w15:restartNumberingAfterBreak="0">
+    <w:nsid w:val="1A5C7BAB"/>
+    <w:multiLevelType w:val="hybridMultilevel"/>
+    <w:tmpl w:val="747075D8"/>
+    <w:lvl w:ilvl="0" w:tplc="6A9A0476">
+      <w:numFmt w:val="bullet"/>
+      <w:lvlText w:val=""/>
+      <w:lvlJc w:val="left"/>
+      <w:pPr>
+        <w:ind w:left="720" w:hanging="360"/>
+      </w:pPr>
+      <w:rPr>
+        <w:rFonts w:ascii="Symbol" w:eastAsia="Times New Roman" w:hAnsi="Symbol" w:cs="Courier New" w:hint="default"/>
+      </w:rPr>
+    </w:lvl>
+    <w:lvl w:ilvl="1" w:tplc="08090003" w:tentative="1">
+      <w:start w:val="1"/>
+      <w:numFmt w:val="bullet"/>
+      <w:lvlText w:val="o"/>
+      <w:lvlJc w:val="left"/>
+      <w:pPr>
+        <w:ind w:left="1440" w:hanging="360"/>
+      </w:pPr>
+      <w:rPr>
+        <w:rFonts w:ascii="Courier New" w:hAnsi="Courier New" w:cs="Courier New" w:hint="default"/>
+      </w:rPr>
+    </w:lvl>
+    <w:lvl w:ilvl="2" w:tplc="08090005" w:tentative="1">
+      <w:start w:val="1"/>
+      <w:numFmt w:val="bullet"/>
+      <w:lvlText w:val=""/>
+      <w:lvlJc w:val="left"/>
+      <w:pPr>
+        <w:ind w:left="2160" w:hanging="360"/>
+      </w:pPr>
+      <w:rPr>
+        <w:rFonts w:ascii="Wingdings" w:hAnsi="Wingdings" w:hint="default"/>
+      </w:rPr>
+    </w:lvl>
+    <w:lvl w:ilvl="3" w:tplc="08090001" w:tentative="1">
+      <w:start w:val="1"/>
+      <w:numFmt w:val="bullet"/>
+      <w:lvlText w:val=""/>
+      <w:lvlJc w:val="left"/>
+      <w:pPr>
+        <w:ind w:left="2880" w:hanging="360"/>
+      </w:pPr>
+      <w:rPr>
+        <w:rFonts w:ascii="Symbol" w:hAnsi="Symbol" w:hint="default"/>
+      </w:rPr>
+    </w:lvl>
+    <w:lvl w:ilvl="4" w:tplc="08090003" w:tentative="1">
+      <w:start w:val="1"/>
+      <w:numFmt w:val="bullet"/>
+      <w:lvlText w:val="o"/>
+      <w:lvlJc w:val="left"/>
+      <w:pPr>
+        <w:ind w:left="3600" w:hanging="360"/>
+      </w:pPr>
+      <w:rPr>
+        <w:rFonts w:ascii="Courier New" w:hAnsi="Courier New" w:cs="Courier New" w:hint="default"/>
+      </w:rPr>
+    </w:lvl>
+    <w:lvl w:ilvl="5" w:tplc="08090005" w:tentative="1">
+      <w:start w:val="1"/>
+      <w:numFmt w:val="bullet"/>
+      <w:lvlText w:val=""/>
+      <w:lvlJc w:val="left"/>
+      <w:pPr>
+        <w:ind w:left="4320" w:hanging="360"/>
+      </w:pPr>
+      <w:rPr>
+        <w:rFonts w:ascii="Wingdings" w:hAnsi="Wingdings" w:hint="default"/>
+      </w:rPr>
+    </w:lvl>
+    <w:lvl w:ilvl="6" w:tplc="08090001" w:tentative="1">
+      <w:start w:val="1"/>
+      <w:numFmt w:val="bullet"/>
+      <w:lvlText w:val=""/>
+      <w:lvlJc w:val="left"/>
+      <w:pPr>
+        <w:ind w:left="5040" w:hanging="360"/>
+      </w:pPr>
+      <w:rPr>
+        <w:rFonts w:ascii="Symbol" w:hAnsi="Symbol" w:hint="default"/>
+      </w:rPr>
+    </w:lvl>
+    <w:lvl w:ilvl="7" w:tplc="08090003" w:tentative="1">
+      <w:start w:val="1"/>
+      <w:numFmt w:val="bullet"/>
+      <w:lvlText w:val="o"/>
+      <w:lvlJc w:val="left"/>
+      <w:pPr>
+        <w:ind w:left="5760" w:hanging="360"/>
+      </w:pPr>
+      <w:rPr>
+        <w:rFonts w:ascii="Courier New" w:hAnsi="Courier New" w:cs="Courier New" w:hint="default"/>
+      </w:rPr>
+    </w:lvl>
+    <w:lvl w:ilvl="8" w:tplc="08090005" w:tentative="1">
+      <w:start w:val="1"/>
+      <w:numFmt w:val="bullet"/>
+      <w:lvlText w:val=""/>
+      <w:lvlJc w:val="left"/>
+      <w:pPr>
+        <w:ind w:left="6480" w:hanging="360"/>
+      </w:pPr>
+      <w:rPr>
+        <w:rFonts w:ascii="Wingdings" w:hAnsi="Wingdings" w:hint="default"/>
+      </w:rPr>
+    </w:lvl>
+  </w:abstractNum>
+  <w:abstractNum w:abstractNumId="14" w15:restartNumberingAfterBreak="0">
     <w:nsid w:val="461C732A"/>
     <w:multiLevelType w:val="multilevel"/>
     <w:tmpl w:val="B6321828"/>
@@ -3790,7 +4570,7 @@
       </w:pPr>
     </w:lvl>
   </w:abstractNum>
-  <w:abstractNum w:abstractNumId="14" w15:restartNumberingAfterBreak="0">
+  <w:abstractNum w:abstractNumId="15" w15:restartNumberingAfterBreak="0">
     <w:nsid w:val="52484A99"/>
     <w:multiLevelType w:val="multilevel"/>
     <w:tmpl w:val="D4A0A496"/>
@@ -3913,13 +4693,13 @@
       </w:rPr>
     </w:lvl>
   </w:abstractNum>
-  <w:abstractNum w:abstractNumId="15" w15:restartNumberingAfterBreak="0">
+  <w:abstractNum w:abstractNumId="16" w15:restartNumberingAfterBreak="0">
     <w:nsid w:val="52D44D27"/>
     <w:multiLevelType w:val="multilevel"/>
     <w:tmpl w:val="D4A0A496"/>
     <w:numStyleLink w:val="AnnexPrime"/>
   </w:abstractNum>
-  <w:abstractNum w:abstractNumId="16" w15:restartNumberingAfterBreak="0">
+  <w:abstractNum w:abstractNumId="17" w15:restartNumberingAfterBreak="0">
     <w:nsid w:val="6B864F28"/>
     <w:multiLevelType w:val="multilevel"/>
     <w:tmpl w:val="37E841EA"/>
@@ -4014,44 +4794,156 @@
       </w:pPr>
     </w:lvl>
   </w:abstractNum>
+  <w:abstractNum w:abstractNumId="18" w15:restartNumberingAfterBreak="0">
+    <w:nsid w:val="794E0842"/>
+    <w:multiLevelType w:val="hybridMultilevel"/>
+    <w:tmpl w:val="CDC0CA62"/>
+    <w:lvl w:ilvl="0" w:tplc="664CD876">
+      <w:numFmt w:val="bullet"/>
+      <w:lvlText w:val=""/>
+      <w:lvlJc w:val="left"/>
+      <w:pPr>
+        <w:ind w:left="720" w:hanging="360"/>
+      </w:pPr>
+      <w:rPr>
+        <w:rFonts w:ascii="Symbol" w:eastAsia="Times New Roman" w:hAnsi="Symbol" w:cs="Courier New" w:hint="default"/>
+      </w:rPr>
+    </w:lvl>
+    <w:lvl w:ilvl="1" w:tplc="08090003" w:tentative="1">
+      <w:start w:val="1"/>
+      <w:numFmt w:val="bullet"/>
+      <w:lvlText w:val="o"/>
+      <w:lvlJc w:val="left"/>
+      <w:pPr>
+        <w:ind w:left="1440" w:hanging="360"/>
+      </w:pPr>
+      <w:rPr>
+        <w:rFonts w:ascii="Courier New" w:hAnsi="Courier New" w:cs="Courier New" w:hint="default"/>
+      </w:rPr>
+    </w:lvl>
+    <w:lvl w:ilvl="2" w:tplc="08090005" w:tentative="1">
+      <w:start w:val="1"/>
+      <w:numFmt w:val="bullet"/>
+      <w:lvlText w:val=""/>
+      <w:lvlJc w:val="left"/>
+      <w:pPr>
+        <w:ind w:left="2160" w:hanging="360"/>
+      </w:pPr>
+      <w:rPr>
+        <w:rFonts w:ascii="Wingdings" w:hAnsi="Wingdings" w:hint="default"/>
+      </w:rPr>
+    </w:lvl>
+    <w:lvl w:ilvl="3" w:tplc="08090001" w:tentative="1">
+      <w:start w:val="1"/>
+      <w:numFmt w:val="bullet"/>
+      <w:lvlText w:val=""/>
+      <w:lvlJc w:val="left"/>
+      <w:pPr>
+        <w:ind w:left="2880" w:hanging="360"/>
+      </w:pPr>
+      <w:rPr>
+        <w:rFonts w:ascii="Symbol" w:hAnsi="Symbol" w:hint="default"/>
+      </w:rPr>
+    </w:lvl>
+    <w:lvl w:ilvl="4" w:tplc="08090003" w:tentative="1">
+      <w:start w:val="1"/>
+      <w:numFmt w:val="bullet"/>
+      <w:lvlText w:val="o"/>
+      <w:lvlJc w:val="left"/>
+      <w:pPr>
+        <w:ind w:left="3600" w:hanging="360"/>
+      </w:pPr>
+      <w:rPr>
+        <w:rFonts w:ascii="Courier New" w:hAnsi="Courier New" w:cs="Courier New" w:hint="default"/>
+      </w:rPr>
+    </w:lvl>
+    <w:lvl w:ilvl="5" w:tplc="08090005" w:tentative="1">
+      <w:start w:val="1"/>
+      <w:numFmt w:val="bullet"/>
+      <w:lvlText w:val=""/>
+      <w:lvlJc w:val="left"/>
+      <w:pPr>
+        <w:ind w:left="4320" w:hanging="360"/>
+      </w:pPr>
+      <w:rPr>
+        <w:rFonts w:ascii="Wingdings" w:hAnsi="Wingdings" w:hint="default"/>
+      </w:rPr>
+    </w:lvl>
+    <w:lvl w:ilvl="6" w:tplc="08090001" w:tentative="1">
+      <w:start w:val="1"/>
+      <w:numFmt w:val="bullet"/>
+      <w:lvlText w:val=""/>
+      <w:lvlJc w:val="left"/>
+      <w:pPr>
+        <w:ind w:left="5040" w:hanging="360"/>
+      </w:pPr>
+      <w:rPr>
+        <w:rFonts w:ascii="Symbol" w:hAnsi="Symbol" w:hint="default"/>
+      </w:rPr>
+    </w:lvl>
+    <w:lvl w:ilvl="7" w:tplc="08090003" w:tentative="1">
+      <w:start w:val="1"/>
+      <w:numFmt w:val="bullet"/>
+      <w:lvlText w:val="o"/>
+      <w:lvlJc w:val="left"/>
+      <w:pPr>
+        <w:ind w:left="5760" w:hanging="360"/>
+      </w:pPr>
+      <w:rPr>
+        <w:rFonts w:ascii="Courier New" w:hAnsi="Courier New" w:cs="Courier New" w:hint="default"/>
+      </w:rPr>
+    </w:lvl>
+    <w:lvl w:ilvl="8" w:tplc="08090005" w:tentative="1">
+      <w:start w:val="1"/>
+      <w:numFmt w:val="bullet"/>
+      <w:lvlText w:val=""/>
+      <w:lvlJc w:val="left"/>
+      <w:pPr>
+        <w:ind w:left="6480" w:hanging="360"/>
+      </w:pPr>
+      <w:rPr>
+        <w:rFonts w:ascii="Wingdings" w:hAnsi="Wingdings" w:hint="default"/>
+      </w:rPr>
+    </w:lvl>
+  </w:abstractNum>
   <w:num w:numId="1" w16cid:durableId="901523458">
-    <w:abstractNumId w:val="13"/>
+    <w:abstractNumId w:val="14"/>
   </w:num>
   <w:num w:numId="2" w16cid:durableId="489753940">
-    <w:abstractNumId w:val="14"/>
+    <w:abstractNumId w:val="15"/>
   </w:num>
   <w:num w:numId="3" w16cid:durableId="835149784">
+    <w:abstractNumId w:val="17"/>
+  </w:num>
+  <w:num w:numId="4" w16cid:durableId="1313216608">
+    <w:abstractNumId w:val="17"/>
+  </w:num>
+  <w:num w:numId="5" w16cid:durableId="1314093877">
+    <w:abstractNumId w:val="17"/>
+  </w:num>
+  <w:num w:numId="6" w16cid:durableId="726689434">
+    <w:abstractNumId w:val="17"/>
+  </w:num>
+  <w:num w:numId="7" w16cid:durableId="605890205">
+    <w:abstractNumId w:val="17"/>
+  </w:num>
+  <w:num w:numId="8" w16cid:durableId="1604416091">
+    <w:abstractNumId w:val="17"/>
+  </w:num>
+  <w:num w:numId="9" w16cid:durableId="1138913953">
+    <w:abstractNumId w:val="17"/>
+  </w:num>
+  <w:num w:numId="10" w16cid:durableId="1736666335">
+    <w:abstractNumId w:val="17"/>
+  </w:num>
+  <w:num w:numId="11" w16cid:durableId="1812356917">
+    <w:abstractNumId w:val="17"/>
+  </w:num>
+  <w:num w:numId="12" w16cid:durableId="807480612">
     <w:abstractNumId w:val="16"/>
   </w:num>
-  <w:num w:numId="4" w16cid:durableId="1313216608">
+  <w:num w:numId="13" w16cid:durableId="1249075977">
     <w:abstractNumId w:val="16"/>
-  </w:num>
-  <w:num w:numId="5" w16cid:durableId="1314093877">
-    <w:abstractNumId w:val="16"/>
-  </w:num>
-  <w:num w:numId="6" w16cid:durableId="726689434">
-    <w:abstractNumId w:val="16"/>
-  </w:num>
-  <w:num w:numId="7" w16cid:durableId="605890205">
-    <w:abstractNumId w:val="16"/>
-  </w:num>
-  <w:num w:numId="8" w16cid:durableId="1604416091">
-    <w:abstractNumId w:val="16"/>
-  </w:num>
-  <w:num w:numId="9" w16cid:durableId="1138913953">
-    <w:abstractNumId w:val="16"/>
-  </w:num>
-  <w:num w:numId="10" w16cid:durableId="1736666335">
-    <w:abstractNumId w:val="16"/>
-  </w:num>
-  <w:num w:numId="11" w16cid:durableId="1812356917">
-    <w:abstractNumId w:val="16"/>
-  </w:num>
-  <w:num w:numId="12" w16cid:durableId="807480612">
-    <w:abstractNumId w:val="15"/>
-  </w:num>
-  <w:num w:numId="13" w16cid:durableId="1249075977">
-    <w:abstractNumId w:val="15"/>
   </w:num>
   <w:num w:numId="14" w16cid:durableId="1241134559">
     <w:abstractNumId w:val="12"/>
@@ -4091,6 +4983,12 @@
   </w:num>
   <w:num w:numId="26" w16cid:durableId="1254045587">
     <w:abstractNumId w:val="0"/>
+  </w:num>
+  <w:num w:numId="27" w16cid:durableId="846140598">
+    <w:abstractNumId w:val="13"/>
+  </w:num>
+  <w:num w:numId="28" w16cid:durableId="1294795650">
+    <w:abstractNumId w:val="18"/>
   </w:num>
 </w:numbering>
 </file>
@@ -4746,7 +5644,6 @@
   <w:style w:type="character" w:default="1" w:styleId="DefaultParagraphFont">
     <w:name w:val="Default Paragraph Font"/>
     <w:uiPriority w:val="1"/>
-    <w:semiHidden/>
     <w:unhideWhenUsed/>
   </w:style>
   <w:style w:type="table" w:default="1" w:styleId="TableNormal">
@@ -7130,6 +8027,34 @@
     </w:pPr>
     <w:rPr>
       <w:rFonts w:ascii="Arial" w:eastAsia="Times New Roman" w:hAnsi="Arial" w:cs="Courier New"/>
+      <w:sz w:val="20"/>
+      <w:szCs w:val="20"/>
+    </w:rPr>
+  </w:style>
+  <w:style w:type="paragraph" w:styleId="HTMLPreformatted">
+    <w:name w:val="HTML Preformatted"/>
+    <w:basedOn w:val="Normal"/>
+    <w:link w:val="HTMLPreformattedChar"/>
+    <w:uiPriority w:val="99"/>
+    <w:semiHidden/>
+    <w:unhideWhenUsed/>
+    <w:rsid w:val="001932D1"/>
+    <w:pPr>
+      <w:spacing w:before="0" w:after="0" w:line="240" w:lineRule="auto"/>
+    </w:pPr>
+    <w:rPr>
+      <w:rFonts w:ascii="Consolas" w:hAnsi="Consolas"/>
+    </w:rPr>
+  </w:style>
+  <w:style w:type="character" w:customStyle="1" w:styleId="HTMLPreformattedChar">
+    <w:name w:val="HTML Preformatted Char"/>
+    <w:basedOn w:val="DefaultParagraphFont"/>
+    <w:link w:val="HTMLPreformatted"/>
+    <w:uiPriority w:val="99"/>
+    <w:semiHidden/>
+    <w:rsid w:val="001932D1"/>
+    <w:rPr>
+      <w:rFonts w:ascii="Consolas" w:eastAsia="Times New Roman" w:hAnsi="Consolas" w:cs="Courier New"/>
       <w:sz w:val="20"/>
       <w:szCs w:val="20"/>
     </w:rPr>

</xml_diff>

<commit_message>
docx files: add GitHub links
</commit_message>
<xml_diff>
--- a/qc-catalogue-api/qc-catalogue-api.docx
+++ b/qc-catalogue-api/qc-catalogue-api.docx
@@ -115,6 +115,40 @@
       <w:r>
         <w:t xml:space="preserve"> data structures.</w:t>
       </w:r>
+    </w:p>
+    <w:p>
+      <w:pPr>
+        <w:pStyle w:val="BodyText"/>
+        <w:rPr>
+          <w:b/>
+          <w:bCs/>
+        </w:rPr>
+      </w:pPr>
+      <w:r>
+        <w:rPr>
+          <w:b/>
+          <w:bCs/>
+        </w:rPr>
+        <w:t>For the latest version of this document and changelogs, XML Schema and other implementation resources, as well as to report issues, please visit the GitHub repository:</w:t>
+      </w:r>
+      <w:r>
+        <w:rPr>
+          <w:b/>
+          <w:bCs/>
+        </w:rPr>
+        <w:t xml:space="preserve"> </w:t>
+      </w:r>
+      <w:hyperlink r:id="rId8" w:history="1">
+        <w:r>
+          <w:rPr>
+            <w:rStyle w:val="Hyperlink"/>
+            <w:rFonts w:cs="Courier New"/>
+            <w:b/>
+            <w:bCs/>
+          </w:rPr>
+          <w:t>https://github.com/ebu/qc</w:t>
+        </w:r>
+      </w:hyperlink>
     </w:p>
     <w:p>
       <w:pPr>
@@ -416,6 +450,7 @@
         <w:pStyle w:val="BodyText"/>
       </w:pPr>
       <w:r>
+        <w:lastRenderedPageBreak/>
         <w:t>A persistent connection, as specified in Section 6.3 of IETF RFC 7230, should be maintained.</w:t>
       </w:r>
     </w:p>
@@ -444,7 +479,6 @@
         <w:pStyle w:val="BodyText"/>
       </w:pPr>
       <w:r>
-        <w:lastRenderedPageBreak/>
         <w:t>The server should support session reuse via session identifiers as specified in IETF RFC 5246.</w:t>
       </w:r>
     </w:p>
@@ -776,27 +810,14 @@
       <w:r>
         <w:t xml:space="preserve">Table </w:t>
       </w:r>
-      <w:r>
-        <w:fldChar w:fldCharType="begin"/>
-      </w:r>
-      <w:r>
-        <w:instrText xml:space="preserve"> SEQ Table \* ARABIC </w:instrText>
-      </w:r>
-      <w:r>
-        <w:fldChar w:fldCharType="separate"/>
-      </w:r>
-      <w:r>
-        <w:rPr>
-          <w:noProof/>
-        </w:rPr>
-        <w:t>1</w:t>
-      </w:r>
-      <w:r>
-        <w:rPr>
-          <w:noProof/>
-        </w:rPr>
-        <w:fldChar w:fldCharType="end"/>
-      </w:r>
+      <w:fldSimple w:instr=" SEQ Table \* ARABIC ">
+        <w:r>
+          <w:rPr>
+            <w:noProof/>
+          </w:rPr>
+          <w:t>1</w:t>
+        </w:r>
+      </w:fldSimple>
       <w:bookmarkEnd w:id="0"/>
       <w:r>
         <w:t>. XML Namespaces and Prefixes.</w:t>
@@ -1052,6 +1073,7 @@
         <w:pStyle w:val="Heading2"/>
       </w:pPr>
       <w:r>
+        <w:lastRenderedPageBreak/>
         <w:t>HTTP Responses</w:t>
       </w:r>
     </w:p>
@@ -1080,7 +1102,6 @@
         <w:pStyle w:val="SBodyTextBullet"/>
       </w:pPr>
       <w:r>
-        <w:lastRenderedPageBreak/>
         <w:t xml:space="preserve">301 Moved Permanently. Returned if the </w:t>
       </w:r>
       <w:r>
@@ -1746,7 +1767,7 @@
                     </pic:cNvPicPr>
                   </pic:nvPicPr>
                   <pic:blipFill>
-                    <a:blip r:embed="rId8" cstate="screen">
+                    <a:blip r:embed="rId9" cstate="screen">
                       <a:extLst>
                         <a:ext uri="{28A0092B-C50C-407E-A947-70E740481C1C}">
                           <a14:useLocalDpi xmlns:a14="http://schemas.microsoft.com/office/drawing/2010/main"/>
@@ -1786,27 +1807,14 @@
       <w:r>
         <w:t xml:space="preserve">Figure </w:t>
       </w:r>
-      <w:r>
-        <w:fldChar w:fldCharType="begin"/>
-      </w:r>
-      <w:r>
-        <w:instrText xml:space="preserve"> SEQ Figure \* ARABIC </w:instrText>
-      </w:r>
-      <w:r>
-        <w:fldChar w:fldCharType="separate"/>
-      </w:r>
-      <w:r>
-        <w:rPr>
-          <w:noProof/>
-        </w:rPr>
-        <w:t>1</w:t>
-      </w:r>
-      <w:r>
-        <w:rPr>
-          <w:noProof/>
-        </w:rPr>
-        <w:fldChar w:fldCharType="end"/>
-      </w:r>
+      <w:fldSimple w:instr=" SEQ Figure \* ARABIC ">
+        <w:r>
+          <w:rPr>
+            <w:noProof/>
+          </w:rPr>
+          <w:t>1</w:t>
+        </w:r>
+      </w:fldSimple>
       <w:bookmarkEnd w:id="2"/>
       <w:r>
         <w:t>. Pictorial Representation of a catalog</w:t>
@@ -2548,10 +2556,7 @@
         <w:pStyle w:val="BodyText"/>
       </w:pPr>
       <w:r>
-        <w:t xml:space="preserve">There shall be one </w:t>
-      </w:r>
-      <w:r>
-        <w:t>/</w:t>
+        <w:t>There shall be one /</w:t>
       </w:r>
       <w:r>
         <w:rPr>
@@ -2560,13 +2565,7 @@
         <w:t>Items/ItemInfo</w:t>
       </w:r>
       <w:r>
-        <w:t xml:space="preserve"> element</w:t>
-      </w:r>
-      <w:r>
-        <w:t xml:space="preserve"> for each item in the catalogue that has </w:t>
-      </w:r>
-      <w:r>
-        <w:t xml:space="preserve">at least one version with a </w:t>
+        <w:t xml:space="preserve"> element for each item in the catalogue that has at least one version with a </w:t>
       </w:r>
       <w:r>
         <w:rPr>
@@ -2592,10 +2591,7 @@
         <w:t>ItemInfo</w:t>
       </w:r>
       <w:r>
-        <w:t xml:space="preserve"> element</w:t>
-      </w:r>
-      <w:r>
-        <w:t>:</w:t>
+        <w:t xml:space="preserve"> element:</w:t>
       </w:r>
     </w:p>
     <w:p>
@@ -2616,13 +2612,7 @@
         <w:t>Versions</w:t>
       </w:r>
       <w:r>
-        <w:t xml:space="preserve"> element </w:t>
-      </w:r>
-      <w:r>
-        <w:t xml:space="preserve">shall </w:t>
-      </w:r>
-      <w:r>
-        <w:t xml:space="preserve">list the </w:t>
+        <w:t xml:space="preserve"> element shall list the </w:t>
       </w:r>
       <w:proofErr w:type="spellStart"/>
       <w:r>
@@ -2666,19 +2656,13 @@
         <w:t>ItemInfo</w:t>
       </w:r>
       <w:r>
+        <w:t xml:space="preserve"> element shall describe the item version</w:t>
+      </w:r>
+      <w:r>
         <w:t xml:space="preserve"> </w:t>
       </w:r>
       <w:r>
-        <w:t>element shall describe the item version</w:t>
-      </w:r>
-      <w:r>
-        <w:t xml:space="preserve"> </w:t>
-      </w:r>
-      <w:r>
-        <w:t>corresponding to the largest version number in t</w:t>
-      </w:r>
-      <w:r>
-        <w:t xml:space="preserve">he </w:t>
+        <w:t xml:space="preserve">corresponding to the largest version number in the </w:t>
       </w:r>
       <w:r>
         <w:rPr>
@@ -3034,10 +3018,7 @@
       </w:r>
       <w:proofErr w:type="spellEnd"/>
       <w:r>
-        <w:t xml:space="preserve"> equal to </w:t>
-      </w:r>
-      <w:r>
-        <w:t>the largest version number in the</w:t>
+        <w:t xml:space="preserve"> equal to the largest version number in the</w:t>
       </w:r>
       <w:r>
         <w:t xml:space="preserve"> </w:t>
@@ -3151,10 +3132,7 @@
         <w:t>{id}</w:t>
       </w:r>
       <w:r>
-        <w:t xml:space="preserve"> </w:t>
-      </w:r>
-      <w:r>
-        <w:t>either:</w:t>
+        <w:t xml:space="preserve"> either:</w:t>
       </w:r>
     </w:p>
     <w:p>
@@ -3181,13 +3159,7 @@
         </w:rPr>
       </w:pPr>
       <w:r>
-        <w:t xml:space="preserve">or </w:t>
-      </w:r>
-      <w:r>
-        <w:t xml:space="preserve">does not have at least one version with </w:t>
-      </w:r>
-      <w:r>
-        <w:t xml:space="preserve">a </w:t>
+        <w:t xml:space="preserve">or does not have at least one version with a </w:t>
       </w:r>
       <w:r>
         <w:rPr>
@@ -3196,13 +3168,7 @@
         <w:t>Status</w:t>
       </w:r>
       <w:r>
-        <w:t xml:space="preserve"> </w:t>
-      </w:r>
-      <w:r>
-        <w:t xml:space="preserve">of </w:t>
-      </w:r>
-      <w:r>
-        <w:t>"published"</w:t>
+        <w:t xml:space="preserve"> of "published"</w:t>
       </w:r>
     </w:p>
     <w:p>
@@ -3658,8 +3624,8 @@
       </w:pPr>
     </w:p>
     <w:sectPr>
-      <w:headerReference w:type="default" r:id="rId9"/>
-      <w:footerReference w:type="default" r:id="rId10"/>
+      <w:headerReference w:type="default" r:id="rId10"/>
+      <w:footerReference w:type="default" r:id="rId11"/>
       <w:pgSz w:w="12240" w:h="15840"/>
       <w:pgMar w:top="1440" w:right="1440" w:bottom="1440" w:left="1440" w:header="720" w:footer="720" w:gutter="0"/>
       <w:cols w:space="720"/>
@@ -3806,6 +3772,10 @@
   <w:p>
     <w:pPr>
       <w:pStyle w:val="Header"/>
+      <w:tabs>
+        <w:tab w:val="clear" w:pos="9720"/>
+        <w:tab w:val="right" w:pos="9356"/>
+      </w:tabs>
       <w:rPr>
         <w:lang w:val="fr-CH"/>
       </w:rPr>
@@ -3834,6 +3804,21 @@
       </w:rPr>
       <w:t xml:space="preserve"> API</w:t>
     </w:r>
+    <w:r>
+      <w:rPr>
+        <w:lang w:val="fr-CH"/>
+      </w:rPr>
+      <w:tab/>
+    </w:r>
+    <w:hyperlink r:id="rId1" w:history="1">
+      <w:r>
+        <w:rPr>
+          <w:rStyle w:val="Hyperlink"/>
+          <w:lang w:val="fr-CH"/>
+        </w:rPr>
+        <w:t>https://github.com/ebu/qc</w:t>
+      </w:r>
+    </w:hyperlink>
     <w:r>
       <w:rPr>
         <w:lang w:val="fr-CH"/>
@@ -5644,6 +5629,7 @@
   <w:style w:type="character" w:default="1" w:styleId="DefaultParagraphFont">
     <w:name w:val="Default Paragraph Font"/>
     <w:uiPriority w:val="1"/>
+    <w:semiHidden/>
     <w:unhideWhenUsed/>
   </w:style>
   <w:style w:type="table" w:default="1" w:styleId="TableNormal">
@@ -8057,6 +8043,18 @@
       <w:rFonts w:ascii="Consolas" w:eastAsia="Times New Roman" w:hAnsi="Consolas" w:cs="Courier New"/>
       <w:sz w:val="20"/>
       <w:szCs w:val="20"/>
+    </w:rPr>
+  </w:style>
+  <w:style w:type="character" w:styleId="UnresolvedMention">
+    <w:name w:val="Unresolved Mention"/>
+    <w:basedOn w:val="DefaultParagraphFont"/>
+    <w:uiPriority w:val="99"/>
+    <w:semiHidden/>
+    <w:unhideWhenUsed/>
+    <w:rsid w:val="004F40C2"/>
+    <w:rPr>
+      <w:color w:val="605E5C"/>
+      <w:shd w:val="clear" w:color="auto" w:fill="E1DFDD"/>
     </w:rPr>
   </w:style>
 </w:styles>
@@ -8352,7 +8350,7 @@
 </file>
 
 <file path=customXml/itemProps1.xml><?xml version="1.0" encoding="utf-8"?>
-<ds:datastoreItem xmlns:ds="http://schemas.openxmlformats.org/officeDocument/2006/customXml" ds:itemID="{B20A613B-5FA6-4585-9226-53B5DA510573}">
+<ds:datastoreItem xmlns:ds="http://schemas.openxmlformats.org/officeDocument/2006/customXml" ds:itemID="{ADEE9E99-0226-44E7-A193-DE2C479C48C9}">
   <ds:schemaRefs>
     <ds:schemaRef ds:uri="http://schemas.openxmlformats.org/officeDocument/2006/bibliography"/>
   </ds:schemaRefs>

</xml_diff>